<commit_message>
chore: include all current script updates
</commit_message>
<xml_diff>
--- a/README.docx
+++ b/README.docx
@@ -148,7 +148,7 @@
           <w:szCs w:val="21"/>
           <w14:ligatures w14:val="none"/>
         </w:rPr>
-        <w:t> 09/07/2026</w:t>
+        <w:t> 23/07/2026</w:t>
       </w:r>
     </w:p>
     <w:p>
@@ -168,8 +168,8 @@
           <w:kern w:val="0"/>
           <w14:ligatures w14:val="none"/>
         </w:rPr>
-        <w:pict w14:anchorId="5FF099A1">
-          <v:rect id="_x0000_i1477" style="width:0;height:.75pt" o:hralign="center" o:hrstd="t" o:hr="t" fillcolor="#a0a0a0" stroked="f"/>
+        <w:pict w14:anchorId="3D30482A">
+          <v:rect id="_x0000_i1486" style="width:0;height:.75pt" o:hralign="center" o:hrstd="t" o:hr="t" fillcolor="#a0a0a0" stroked="f"/>
         </w:pict>
       </w:r>
     </w:p>
@@ -355,7 +355,7 @@
       <w:pPr>
         <w:numPr>
           <w:ilvl w:val="0"/>
-          <w:numId w:val="30"/>
+          <w:numId w:val="38"/>
         </w:numPr>
         <w:spacing w:before="100" w:beforeAutospacing="1" w:after="100" w:afterAutospacing="1" w:line="240" w:lineRule="auto"/>
         <w:rPr>
@@ -376,7 +376,91 @@
           <w:szCs w:val="21"/>
           <w14:ligatures w14:val="none"/>
         </w:rPr>
-        <w:t>Hide user from Global Address List (GAL)</w:t>
+        <w:t>Hide from GAL</w:t>
+      </w:r>
+    </w:p>
+    <w:p>
+      <w:pPr>
+        <w:numPr>
+          <w:ilvl w:val="0"/>
+          <w:numId w:val="38"/>
+        </w:numPr>
+        <w:spacing w:before="100" w:beforeAutospacing="1" w:after="100" w:afterAutospacing="1" w:line="240" w:lineRule="auto"/>
+        <w:rPr>
+          <w:rFonts w:ascii="Segoe UI" w:eastAsia="Times New Roman" w:hAnsi="Segoe UI" w:cs="Segoe UI"/>
+          <w:color w:val="202020"/>
+          <w:kern w:val="0"/>
+          <w:sz w:val="21"/>
+          <w:szCs w:val="21"/>
+          <w14:ligatures w14:val="none"/>
+        </w:rPr>
+      </w:pPr>
+      <w:r>
+        <w:rPr>
+          <w:rFonts w:ascii="Segoe UI" w:eastAsia="Times New Roman" w:hAnsi="Segoe UI" w:cs="Segoe UI"/>
+          <w:color w:val="202020"/>
+          <w:kern w:val="0"/>
+          <w:sz w:val="21"/>
+          <w:szCs w:val="21"/>
+          <w14:ligatures w14:val="none"/>
+        </w:rPr>
+        <w:t>Remove reporting manager</w:t>
+      </w:r>
+    </w:p>
+    <w:p>
+      <w:pPr>
+        <w:numPr>
+          <w:ilvl w:val="0"/>
+          <w:numId w:val="38"/>
+        </w:numPr>
+        <w:spacing w:before="100" w:beforeAutospacing="1" w:after="100" w:afterAutospacing="1" w:line="240" w:lineRule="auto"/>
+        <w:rPr>
+          <w:rFonts w:ascii="Segoe UI" w:eastAsia="Times New Roman" w:hAnsi="Segoe UI" w:cs="Segoe UI"/>
+          <w:color w:val="202020"/>
+          <w:kern w:val="0"/>
+          <w:sz w:val="21"/>
+          <w:szCs w:val="21"/>
+          <w14:ligatures w14:val="none"/>
+        </w:rPr>
+      </w:pPr>
+      <w:r>
+        <w:rPr>
+          <w:rFonts w:ascii="Segoe UI" w:eastAsia="Times New Roman" w:hAnsi="Segoe UI" w:cs="Segoe UI"/>
+          <w:color w:val="202020"/>
+          <w:kern w:val="0"/>
+          <w:sz w:val="21"/>
+          <w:szCs w:val="21"/>
+          <w14:ligatures w14:val="none"/>
+        </w:rPr>
+        <w:t>Remove all roles</w:t>
+      </w:r>
+    </w:p>
+    <w:p>
+      <w:pPr>
+        <w:numPr>
+          <w:ilvl w:val="0"/>
+          <w:numId w:val="38"/>
+        </w:numPr>
+        <w:spacing w:before="100" w:beforeAutospacing="1" w:after="100" w:afterAutospacing="1" w:line="240" w:lineRule="auto"/>
+        <w:rPr>
+          <w:rFonts w:ascii="Segoe UI" w:eastAsia="Times New Roman" w:hAnsi="Segoe UI" w:cs="Segoe UI"/>
+          <w:color w:val="202020"/>
+          <w:kern w:val="0"/>
+          <w:sz w:val="21"/>
+          <w:szCs w:val="21"/>
+          <w14:ligatures w14:val="none"/>
+        </w:rPr>
+      </w:pPr>
+      <w:r>
+        <w:rPr>
+          <w:rFonts w:ascii="Segoe UI" w:eastAsia="Times New Roman" w:hAnsi="Segoe UI" w:cs="Segoe UI"/>
+          <w:color w:val="202020"/>
+          <w:kern w:val="0"/>
+          <w:sz w:val="21"/>
+          <w:szCs w:val="21"/>
+          <w14:ligatures w14:val="none"/>
+        </w:rPr>
+        <w:t>Block sign-in</w:t>
       </w:r>
     </w:p>
     <w:p>
@@ -436,7 +520,7 @@
       <w:pPr>
         <w:numPr>
           <w:ilvl w:val="0"/>
-          <w:numId w:val="31"/>
+          <w:numId w:val="39"/>
         </w:numPr>
         <w:spacing w:before="100" w:beforeAutospacing="1" w:after="100" w:afterAutospacing="1" w:line="240" w:lineRule="auto"/>
         <w:rPr>
@@ -448,113 +532,16 @@
           <w14:ligatures w14:val="none"/>
         </w:rPr>
       </w:pPr>
-      <w:proofErr w:type="gramStart"/>
-      <w:r>
-        <w:rPr>
-          <w:rFonts w:ascii="Segoe UI" w:eastAsia="Times New Roman" w:hAnsi="Segoe UI" w:cs="Segoe UI"/>
-          <w:color w:val="202020"/>
-          <w:kern w:val="0"/>
-          <w:sz w:val="21"/>
-          <w:szCs w:val="21"/>
-          <w14:ligatures w14:val="none"/>
-        </w:rPr>
-        <w:t>Remove</w:t>
-      </w:r>
-      <w:proofErr w:type="gramEnd"/>
-      <w:r>
-        <w:rPr>
-          <w:rFonts w:ascii="Segoe UI" w:eastAsia="Times New Roman" w:hAnsi="Segoe UI" w:cs="Segoe UI"/>
-          <w:color w:val="202020"/>
-          <w:kern w:val="0"/>
-          <w:sz w:val="21"/>
-          <w:szCs w:val="21"/>
-          <w14:ligatures w14:val="none"/>
-        </w:rPr>
-        <w:t xml:space="preserve"> Reporting Manager</w:t>
-      </w:r>
-    </w:p>
-    <w:p>
-      <w:pPr>
-        <w:numPr>
-          <w:ilvl w:val="0"/>
-          <w:numId w:val="31"/>
-        </w:numPr>
-        <w:spacing w:before="100" w:beforeAutospacing="1" w:after="100" w:afterAutospacing="1" w:line="240" w:lineRule="auto"/>
-        <w:rPr>
-          <w:rFonts w:ascii="Segoe UI" w:eastAsia="Times New Roman" w:hAnsi="Segoe UI" w:cs="Segoe UI"/>
-          <w:color w:val="202020"/>
-          <w:kern w:val="0"/>
-          <w:sz w:val="21"/>
-          <w:szCs w:val="21"/>
-          <w14:ligatures w14:val="none"/>
-        </w:rPr>
-      </w:pPr>
-      <w:r>
-        <w:rPr>
-          <w:rFonts w:ascii="Segoe UI" w:eastAsia="Times New Roman" w:hAnsi="Segoe UI" w:cs="Segoe UI"/>
-          <w:color w:val="202020"/>
-          <w:kern w:val="0"/>
-          <w:sz w:val="21"/>
-          <w:szCs w:val="21"/>
-          <w14:ligatures w14:val="none"/>
-        </w:rPr>
-        <w:t>Remove Entra Roles</w:t>
-      </w:r>
-    </w:p>
-    <w:p>
-      <w:pPr>
-        <w:numPr>
-          <w:ilvl w:val="0"/>
-          <w:numId w:val="31"/>
-        </w:numPr>
-        <w:spacing w:before="100" w:beforeAutospacing="1" w:after="100" w:afterAutospacing="1" w:line="240" w:lineRule="auto"/>
-        <w:rPr>
-          <w:rFonts w:ascii="Segoe UI" w:eastAsia="Times New Roman" w:hAnsi="Segoe UI" w:cs="Segoe UI"/>
-          <w:color w:val="202020"/>
-          <w:kern w:val="0"/>
-          <w:sz w:val="21"/>
-          <w:szCs w:val="21"/>
-          <w14:ligatures w14:val="none"/>
-        </w:rPr>
-      </w:pPr>
-      <w:r>
-        <w:rPr>
-          <w:rFonts w:ascii="Segoe UI" w:eastAsia="Times New Roman" w:hAnsi="Segoe UI" w:cs="Segoe UI"/>
-          <w:color w:val="202020"/>
-          <w:kern w:val="0"/>
-          <w:sz w:val="21"/>
-          <w:szCs w:val="21"/>
-          <w14:ligatures w14:val="none"/>
-        </w:rPr>
-        <w:t>Block Sign-In</w:t>
-      </w:r>
-    </w:p>
-    <w:p>
-      <w:pPr>
-        <w:numPr>
-          <w:ilvl w:val="0"/>
-          <w:numId w:val="31"/>
-        </w:numPr>
-        <w:spacing w:before="100" w:beforeAutospacing="1" w:after="100" w:afterAutospacing="1" w:line="240" w:lineRule="auto"/>
-        <w:rPr>
-          <w:rFonts w:ascii="Segoe UI" w:eastAsia="Times New Roman" w:hAnsi="Segoe UI" w:cs="Segoe UI"/>
-          <w:color w:val="202020"/>
-          <w:kern w:val="0"/>
-          <w:sz w:val="21"/>
-          <w:szCs w:val="21"/>
-          <w14:ligatures w14:val="none"/>
-        </w:rPr>
-      </w:pPr>
-      <w:r>
-        <w:rPr>
-          <w:rFonts w:ascii="Segoe UI" w:eastAsia="Times New Roman" w:hAnsi="Segoe UI" w:cs="Segoe UI"/>
-          <w:color w:val="202020"/>
-          <w:kern w:val="0"/>
-          <w:sz w:val="21"/>
-          <w:szCs w:val="21"/>
-          <w14:ligatures w14:val="none"/>
-        </w:rPr>
-        <w:t>Delete User</w:t>
+      <w:r>
+        <w:rPr>
+          <w:rFonts w:ascii="Segoe UI" w:eastAsia="Times New Roman" w:hAnsi="Segoe UI" w:cs="Segoe UI"/>
+          <w:color w:val="202020"/>
+          <w:kern w:val="0"/>
+          <w:sz w:val="21"/>
+          <w:szCs w:val="21"/>
+          <w14:ligatures w14:val="none"/>
+        </w:rPr>
+        <w:t>Delete user</w:t>
       </w:r>
     </w:p>
     <w:p>
@@ -574,8 +561,8 @@
           <w:kern w:val="0"/>
           <w14:ligatures w14:val="none"/>
         </w:rPr>
-        <w:pict w14:anchorId="2C429300">
-          <v:rect id="_x0000_i1478" style="width:0;height:.75pt" o:hralign="center" o:hrstd="t" o:hr="t" fillcolor="#a0a0a0" stroked="f"/>
+        <w:pict w14:anchorId="004D4323">
+          <v:rect id="_x0000_i1487" style="width:0;height:.75pt" o:hralign="center" o:hrstd="t" o:hr="t" fillcolor="#a0a0a0" stroked="f"/>
         </w:pict>
       </w:r>
     </w:p>
@@ -775,8 +762,8 @@
           <w:kern w:val="0"/>
           <w14:ligatures w14:val="none"/>
         </w:rPr>
-        <w:pict w14:anchorId="110E34DB">
-          <v:rect id="_x0000_i1479" style="width:0;height:.75pt" o:hralign="center" o:hrstd="t" o:hr="t" fillcolor="#a0a0a0" stroked="f"/>
+        <w:pict w14:anchorId="2F153AF5">
+          <v:rect id="_x0000_i1488" style="width:0;height:.75pt" o:hralign="center" o:hrstd="t" o:hr="t" fillcolor="#a0a0a0" stroked="f"/>
         </w:pict>
       </w:r>
     </w:p>
@@ -1137,8 +1124,8 @@
           <w:kern w:val="0"/>
           <w14:ligatures w14:val="none"/>
         </w:rPr>
-        <w:pict w14:anchorId="690E5E78">
-          <v:rect id="_x0000_i1480" style="width:0;height:.75pt" o:hralign="center" o:hrstd="t" o:hr="t" fillcolor="#a0a0a0" stroked="f"/>
+        <w:pict w14:anchorId="5C83870B">
+          <v:rect id="_x0000_i1489" style="width:0;height:.75pt" o:hralign="center" o:hrstd="t" o:hr="t" fillcolor="#a0a0a0" stroked="f"/>
         </w:pict>
       </w:r>
     </w:p>
@@ -1500,8 +1487,8 @@
           <w:kern w:val="0"/>
           <w14:ligatures w14:val="none"/>
         </w:rPr>
-        <w:pict w14:anchorId="674B022D">
-          <v:rect id="_x0000_i1481" style="width:0;height:.75pt" o:hralign="center" o:hrstd="t" o:hr="t" fillcolor="#a0a0a0" stroked="f"/>
+        <w:pict w14:anchorId="3CE0A882">
+          <v:rect id="_x0000_i1490" style="width:0;height:.75pt" o:hralign="center" o:hrstd="t" o:hr="t" fillcolor="#a0a0a0" stroked="f"/>
         </w:pict>
       </w:r>
     </w:p>
@@ -1615,7 +1602,7 @@
       <w:pPr>
         <w:numPr>
           <w:ilvl w:val="0"/>
-          <w:numId w:val="32"/>
+          <w:numId w:val="40"/>
         </w:numPr>
         <w:spacing w:before="100" w:beforeAutospacing="1" w:after="100" w:afterAutospacing="1" w:line="240" w:lineRule="auto"/>
         <w:rPr>
@@ -1636,7 +1623,7 @@
           <w:szCs w:val="21"/>
           <w14:ligatures w14:val="none"/>
         </w:rPr>
-        <w:t>Hide user from GAL</w:t>
+        <w:t>Hide from GAL</w:t>
       </w:r>
     </w:p>
     <w:p>
@@ -1696,7 +1683,7 @@
       <w:pPr>
         <w:numPr>
           <w:ilvl w:val="0"/>
-          <w:numId w:val="33"/>
+          <w:numId w:val="41"/>
         </w:numPr>
         <w:spacing w:before="100" w:beforeAutospacing="1" w:after="100" w:afterAutospacing="1" w:line="240" w:lineRule="auto"/>
         <w:rPr>
@@ -1708,36 +1695,23 @@
           <w14:ligatures w14:val="none"/>
         </w:rPr>
       </w:pPr>
-      <w:proofErr w:type="gramStart"/>
-      <w:r>
-        <w:rPr>
-          <w:rFonts w:ascii="Segoe UI" w:eastAsia="Times New Roman" w:hAnsi="Segoe UI" w:cs="Segoe UI"/>
-          <w:color w:val="202020"/>
-          <w:kern w:val="0"/>
-          <w:sz w:val="21"/>
-          <w:szCs w:val="21"/>
-          <w14:ligatures w14:val="none"/>
-        </w:rPr>
-        <w:t>Remove</w:t>
-      </w:r>
-      <w:proofErr w:type="gramEnd"/>
-      <w:r>
-        <w:rPr>
-          <w:rFonts w:ascii="Segoe UI" w:eastAsia="Times New Roman" w:hAnsi="Segoe UI" w:cs="Segoe UI"/>
-          <w:color w:val="202020"/>
-          <w:kern w:val="0"/>
-          <w:sz w:val="21"/>
-          <w:szCs w:val="21"/>
-          <w14:ligatures w14:val="none"/>
-        </w:rPr>
-        <w:t xml:space="preserve"> Reporting Manager</w:t>
+      <w:r>
+        <w:rPr>
+          <w:rFonts w:ascii="Segoe UI" w:eastAsia="Times New Roman" w:hAnsi="Segoe UI" w:cs="Segoe UI"/>
+          <w:color w:val="202020"/>
+          <w:kern w:val="0"/>
+          <w:sz w:val="21"/>
+          <w:szCs w:val="21"/>
+          <w14:ligatures w14:val="none"/>
+        </w:rPr>
+        <w:t>Remove reporting manager</w:t>
       </w:r>
     </w:p>
     <w:p>
       <w:pPr>
         <w:numPr>
           <w:ilvl w:val="0"/>
-          <w:numId w:val="33"/>
+          <w:numId w:val="41"/>
         </w:numPr>
         <w:spacing w:before="100" w:beforeAutospacing="1" w:after="100" w:afterAutospacing="1" w:line="240" w:lineRule="auto"/>
         <w:rPr>
@@ -1758,14 +1732,14 @@
           <w:szCs w:val="21"/>
           <w14:ligatures w14:val="none"/>
         </w:rPr>
-        <w:t>Remove Entra Roles</w:t>
+        <w:t>Remove all roles</w:t>
       </w:r>
     </w:p>
     <w:p>
       <w:pPr>
         <w:numPr>
           <w:ilvl w:val="0"/>
-          <w:numId w:val="33"/>
+          <w:numId w:val="41"/>
         </w:numPr>
         <w:spacing w:before="100" w:beforeAutospacing="1" w:after="100" w:afterAutospacing="1" w:line="240" w:lineRule="auto"/>
         <w:rPr>
@@ -1787,14 +1761,14 @@
           <w14:ligatures w14:val="none"/>
         </w:rPr>
         <w:lastRenderedPageBreak/>
-        <w:t>Block Sign-In</w:t>
+        <w:t>Block sign-in</w:t>
       </w:r>
     </w:p>
     <w:p>
       <w:pPr>
         <w:numPr>
           <w:ilvl w:val="0"/>
-          <w:numId w:val="33"/>
+          <w:numId w:val="41"/>
         </w:numPr>
         <w:spacing w:before="100" w:beforeAutospacing="1" w:after="100" w:afterAutospacing="1" w:line="240" w:lineRule="auto"/>
         <w:rPr>
@@ -1815,7 +1789,7 @@
           <w:szCs w:val="21"/>
           <w14:ligatures w14:val="none"/>
         </w:rPr>
-        <w:t>Delete User</w:t>
+        <w:t>Delete user</w:t>
       </w:r>
     </w:p>
     <w:p>
@@ -1957,8 +1931,8 @@
           <w:kern w:val="0"/>
           <w14:ligatures w14:val="none"/>
         </w:rPr>
-        <w:pict w14:anchorId="439F575B">
-          <v:rect id="_x0000_i1482" style="width:0;height:.75pt" o:hralign="center" o:hrstd="t" o:hr="t" fillcolor="#a0a0a0" stroked="f"/>
+        <w:pict w14:anchorId="11AD5234">
+          <v:rect id="_x0000_i1491" style="width:0;height:.75pt" o:hralign="center" o:hrstd="t" o:hr="t" fillcolor="#a0a0a0" stroked="f"/>
         </w:pict>
       </w:r>
     </w:p>
@@ -2346,8 +2320,8 @@
           <w:kern w:val="0"/>
           <w14:ligatures w14:val="none"/>
         </w:rPr>
-        <w:pict w14:anchorId="52E7242F">
-          <v:rect id="_x0000_i1483" style="width:0;height:.75pt" o:hralign="center" o:hrstd="t" o:hr="t" fillcolor="#a0a0a0" stroked="f"/>
+        <w:pict w14:anchorId="4137599A">
+          <v:rect id="_x0000_i1492" style="width:0;height:.75pt" o:hralign="center" o:hrstd="t" o:hr="t" fillcolor="#a0a0a0" stroked="f"/>
         </w:pict>
       </w:r>
     </w:p>
@@ -2838,8 +2812,8 @@
           <w:kern w:val="0"/>
           <w14:ligatures w14:val="none"/>
         </w:rPr>
-        <w:pict w14:anchorId="08640F05">
-          <v:rect id="_x0000_i1484" style="width:0;height:.75pt" o:hralign="center" o:hrstd="t" o:hr="t" fillcolor="#a0a0a0" stroked="f"/>
+        <w:pict w14:anchorId="03753214">
+          <v:rect id="_x0000_i1493" style="width:0;height:.75pt" o:hralign="center" o:hrstd="t" o:hr="t" fillcolor="#a0a0a0" stroked="f"/>
         </w:pict>
       </w:r>
     </w:p>
@@ -3072,7 +3046,7 @@
       <w:pPr>
         <w:numPr>
           <w:ilvl w:val="0"/>
-          <w:numId w:val="34"/>
+          <w:numId w:val="42"/>
         </w:numPr>
         <w:spacing w:before="100" w:beforeAutospacing="1" w:after="100" w:afterAutospacing="1" w:line="240" w:lineRule="auto"/>
         <w:rPr>
@@ -3100,7 +3074,7 @@
       <w:pPr>
         <w:numPr>
           <w:ilvl w:val="0"/>
-          <w:numId w:val="34"/>
+          <w:numId w:val="42"/>
         </w:numPr>
         <w:spacing w:before="100" w:beforeAutospacing="1" w:after="100" w:afterAutospacing="1" w:line="240" w:lineRule="auto"/>
         <w:rPr>
@@ -3128,7 +3102,7 @@
       <w:pPr>
         <w:numPr>
           <w:ilvl w:val="0"/>
-          <w:numId w:val="34"/>
+          <w:numId w:val="42"/>
         </w:numPr>
         <w:spacing w:before="100" w:beforeAutospacing="1" w:after="100" w:afterAutospacing="1" w:line="240" w:lineRule="auto"/>
         <w:rPr>
@@ -3169,8 +3143,8 @@
           <w:kern w:val="0"/>
           <w14:ligatures w14:val="none"/>
         </w:rPr>
-        <w:pict w14:anchorId="01A0F488">
-          <v:rect id="_x0000_i1485" style="width:0;height:.75pt" o:hralign="center" o:hrstd="t" o:hr="t" fillcolor="#a0a0a0" stroked="f"/>
+        <w:pict w14:anchorId="420EE788">
+          <v:rect id="_x0000_i1494" style="width:0;height:.75pt" o:hralign="center" o:hrstd="t" o:hr="t" fillcolor="#a0a0a0" stroked="f"/>
         </w:pict>
       </w:r>
     </w:p>
@@ -3944,8 +3918,8 @@
           <w:kern w:val="0"/>
           <w14:ligatures w14:val="none"/>
         </w:rPr>
-        <w:pict w14:anchorId="16D1C459">
-          <v:rect id="_x0000_i1486" style="width:0;height:.75pt" o:hralign="center" o:hrstd="t" o:hr="t" fillcolor="#a0a0a0" stroked="f"/>
+        <w:pict w14:anchorId="50D52412">
+          <v:rect id="_x0000_i1495" style="width:0;height:.75pt" o:hralign="center" o:hrstd="t" o:hr="t" fillcolor="#a0a0a0" stroked="f"/>
         </w:pict>
       </w:r>
     </w:p>
@@ -4213,82 +4187,7 @@
           <w:szCs w:val="21"/>
           <w14:ligatures w14:val="none"/>
         </w:rPr>
-        <w:t>Hide user from GAL</w:t>
-      </w:r>
-    </w:p>
-    <w:p>
-      <w:pPr>
-        <w:spacing w:after="0" w:line="240" w:lineRule="auto"/>
-        <w:rPr>
-          <w:rFonts w:ascii="Segoe UI" w:eastAsia="Times New Roman" w:hAnsi="Segoe UI" w:cs="Segoe UI"/>
-          <w:kern w:val="0"/>
-          <w:sz w:val="21"/>
-          <w:szCs w:val="21"/>
-          <w14:ligatures w14:val="none"/>
-        </w:rPr>
-      </w:pPr>
-      <w:r>
-        <w:rPr>
-          <w:rFonts w:ascii="Times New Roman" w:eastAsia="Times New Roman" w:hAnsi="Times New Roman" w:cs="Times New Roman"/>
-          <w:kern w:val="0"/>
-          <w14:ligatures w14:val="none"/>
-        </w:rPr>
-        <w:pict w14:anchorId="086653FE">
-          <v:rect id="_x0000_i1487" style="width:0;height:.75pt" o:hralign="center" o:hrstd="t" o:hr="t" fillcolor="#a0a0a0" stroked="f"/>
-        </w:pict>
-      </w:r>
-    </w:p>
-    <w:p>
-      <w:pPr>
-        <w:spacing w:before="360" w:after="240" w:line="240" w:lineRule="auto"/>
-        <w:outlineLvl w:val="2"/>
-        <w:rPr>
-          <w:rFonts w:ascii="Segoe UI" w:eastAsia="Times New Roman" w:hAnsi="Segoe UI" w:cs="Segoe UI"/>
-          <w:b/>
-          <w:bCs/>
-          <w:color w:val="202020"/>
-          <w:kern w:val="0"/>
-          <w:sz w:val="30"/>
-          <w:szCs w:val="30"/>
-          <w14:ligatures w14:val="none"/>
-        </w:rPr>
-      </w:pPr>
-      <w:r>
-        <w:rPr>
-          <w:rFonts w:ascii="Segoe UI" w:eastAsia="Times New Roman" w:hAnsi="Segoe UI" w:cs="Segoe UI"/>
-          <w:b/>
-          <w:bCs/>
-          <w:color w:val="202020"/>
-          <w:kern w:val="0"/>
-          <w:sz w:val="30"/>
-          <w:szCs w:val="30"/>
-          <w14:ligatures w14:val="none"/>
-        </w:rPr>
-        <w:t>To be deleted</w:t>
-      </w:r>
-    </w:p>
-    <w:p>
-      <w:pPr>
-        <w:spacing w:after="240" w:line="240" w:lineRule="auto"/>
-        <w:rPr>
-          <w:rFonts w:ascii="Segoe UI" w:eastAsia="Times New Roman" w:hAnsi="Segoe UI" w:cs="Segoe UI"/>
-          <w:color w:val="202020"/>
-          <w:kern w:val="0"/>
-          <w:sz w:val="21"/>
-          <w:szCs w:val="21"/>
-          <w14:ligatures w14:val="none"/>
-        </w:rPr>
-      </w:pPr>
-      <w:r>
-        <w:rPr>
-          <w:rFonts w:ascii="Segoe UI" w:eastAsia="Times New Roman" w:hAnsi="Segoe UI" w:cs="Segoe UI"/>
-          <w:color w:val="202020"/>
-          <w:kern w:val="0"/>
-          <w:sz w:val="21"/>
-          <w:szCs w:val="21"/>
-          <w14:ligatures w14:val="none"/>
-        </w:rPr>
-        <w:t>Accepted value:</w:t>
+        <w:t>Hide from GAL</w:t>
       </w:r>
     </w:p>
     <w:p>
@@ -4337,31 +4236,7 @@
           <w:szCs w:val="21"/>
           <w14:ligatures w14:val="none"/>
         </w:rPr>
-        <w:t>To be deleted</w:t>
-      </w:r>
-    </w:p>
-    <w:p>
-      <w:pPr>
-        <w:spacing w:after="240" w:line="240" w:lineRule="auto"/>
-        <w:rPr>
-          <w:rFonts w:ascii="Segoe UI" w:eastAsia="Times New Roman" w:hAnsi="Segoe UI" w:cs="Segoe UI"/>
-          <w:color w:val="202020"/>
-          <w:kern w:val="0"/>
-          <w:sz w:val="21"/>
-          <w:szCs w:val="21"/>
-          <w14:ligatures w14:val="none"/>
-        </w:rPr>
-      </w:pPr>
-      <w:r>
-        <w:rPr>
-          <w:rFonts w:ascii="Segoe UI" w:eastAsia="Times New Roman" w:hAnsi="Segoe UI" w:cs="Segoe UI"/>
-          <w:color w:val="202020"/>
-          <w:kern w:val="0"/>
-          <w:sz w:val="21"/>
-          <w:szCs w:val="21"/>
-          <w14:ligatures w14:val="none"/>
-        </w:rPr>
-        <w:t>Actions performed:</w:t>
+        <w:t>Remove reporting manager</w:t>
       </w:r>
     </w:p>
     <w:p>
@@ -4401,29 +4276,16 @@
           <w14:ligatures w14:val="none"/>
         </w:rPr>
       </w:pPr>
-      <w:proofErr w:type="gramStart"/>
-      <w:r>
-        <w:rPr>
-          <w:rFonts w:ascii="Consolas" w:eastAsia="Times New Roman" w:hAnsi="Consolas" w:cs="Courier New"/>
-          <w:color w:val="202020"/>
-          <w:kern w:val="0"/>
-          <w:sz w:val="21"/>
-          <w:szCs w:val="21"/>
-          <w14:ligatures w14:val="none"/>
-        </w:rPr>
-        <w:t>Remove</w:t>
-      </w:r>
-      <w:proofErr w:type="gramEnd"/>
-      <w:r>
-        <w:rPr>
-          <w:rFonts w:ascii="Consolas" w:eastAsia="Times New Roman" w:hAnsi="Consolas" w:cs="Courier New"/>
-          <w:color w:val="202020"/>
-          <w:kern w:val="0"/>
-          <w:sz w:val="21"/>
-          <w:szCs w:val="21"/>
-          <w14:ligatures w14:val="none"/>
-        </w:rPr>
-        <w:t xml:space="preserve"> Reporting Manager</w:t>
+      <w:r>
+        <w:rPr>
+          <w:rFonts w:ascii="Consolas" w:eastAsia="Times New Roman" w:hAnsi="Consolas" w:cs="Courier New"/>
+          <w:color w:val="202020"/>
+          <w:kern w:val="0"/>
+          <w:sz w:val="21"/>
+          <w:szCs w:val="21"/>
+          <w14:ligatures w14:val="none"/>
+        </w:rPr>
+        <w:t>Remove all roles</w:t>
       </w:r>
     </w:p>
     <w:p>
@@ -4472,7 +4334,82 @@
           <w:szCs w:val="21"/>
           <w14:ligatures w14:val="none"/>
         </w:rPr>
-        <w:t>Remove Entra Roles</w:t>
+        <w:t>Block sign-in</w:t>
+      </w:r>
+    </w:p>
+    <w:p>
+      <w:pPr>
+        <w:spacing w:after="0" w:line="240" w:lineRule="auto"/>
+        <w:rPr>
+          <w:rFonts w:ascii="Segoe UI" w:eastAsia="Times New Roman" w:hAnsi="Segoe UI" w:cs="Segoe UI"/>
+          <w:kern w:val="0"/>
+          <w:sz w:val="21"/>
+          <w:szCs w:val="21"/>
+          <w14:ligatures w14:val="none"/>
+        </w:rPr>
+      </w:pPr>
+      <w:r>
+        <w:rPr>
+          <w:rFonts w:ascii="Times New Roman" w:eastAsia="Times New Roman" w:hAnsi="Times New Roman" w:cs="Times New Roman"/>
+          <w:kern w:val="0"/>
+          <w14:ligatures w14:val="none"/>
+        </w:rPr>
+        <w:pict w14:anchorId="1BD5B450">
+          <v:rect id="_x0000_i1496" style="width:0;height:.75pt" o:hralign="center" o:hrstd="t" o:hr="t" fillcolor="#a0a0a0" stroked="f"/>
+        </w:pict>
+      </w:r>
+    </w:p>
+    <w:p>
+      <w:pPr>
+        <w:spacing w:before="360" w:after="240" w:line="240" w:lineRule="auto"/>
+        <w:outlineLvl w:val="2"/>
+        <w:rPr>
+          <w:rFonts w:ascii="Segoe UI" w:eastAsia="Times New Roman" w:hAnsi="Segoe UI" w:cs="Segoe UI"/>
+          <w:b/>
+          <w:bCs/>
+          <w:color w:val="202020"/>
+          <w:kern w:val="0"/>
+          <w:sz w:val="30"/>
+          <w:szCs w:val="30"/>
+          <w14:ligatures w14:val="none"/>
+        </w:rPr>
+      </w:pPr>
+      <w:r>
+        <w:rPr>
+          <w:rFonts w:ascii="Segoe UI" w:eastAsia="Times New Roman" w:hAnsi="Segoe UI" w:cs="Segoe UI"/>
+          <w:b/>
+          <w:bCs/>
+          <w:color w:val="202020"/>
+          <w:kern w:val="0"/>
+          <w:sz w:val="30"/>
+          <w:szCs w:val="30"/>
+          <w14:ligatures w14:val="none"/>
+        </w:rPr>
+        <w:t>To be deleted</w:t>
+      </w:r>
+    </w:p>
+    <w:p>
+      <w:pPr>
+        <w:spacing w:after="240" w:line="240" w:lineRule="auto"/>
+        <w:rPr>
+          <w:rFonts w:ascii="Segoe UI" w:eastAsia="Times New Roman" w:hAnsi="Segoe UI" w:cs="Segoe UI"/>
+          <w:color w:val="202020"/>
+          <w:kern w:val="0"/>
+          <w:sz w:val="21"/>
+          <w:szCs w:val="21"/>
+          <w14:ligatures w14:val="none"/>
+        </w:rPr>
+      </w:pPr>
+      <w:r>
+        <w:rPr>
+          <w:rFonts w:ascii="Segoe UI" w:eastAsia="Times New Roman" w:hAnsi="Segoe UI" w:cs="Segoe UI"/>
+          <w:color w:val="202020"/>
+          <w:kern w:val="0"/>
+          <w:sz w:val="21"/>
+          <w:szCs w:val="21"/>
+          <w14:ligatures w14:val="none"/>
+        </w:rPr>
+        <w:t>Accepted value:</w:t>
       </w:r>
     </w:p>
     <w:p>
@@ -4521,7 +4458,31 @@
           <w:szCs w:val="21"/>
           <w14:ligatures w14:val="none"/>
         </w:rPr>
-        <w:t>Block Sign-In</w:t>
+        <w:t>To be deleted</w:t>
+      </w:r>
+    </w:p>
+    <w:p>
+      <w:pPr>
+        <w:spacing w:after="240" w:line="240" w:lineRule="auto"/>
+        <w:rPr>
+          <w:rFonts w:ascii="Segoe UI" w:eastAsia="Times New Roman" w:hAnsi="Segoe UI" w:cs="Segoe UI"/>
+          <w:color w:val="202020"/>
+          <w:kern w:val="0"/>
+          <w:sz w:val="21"/>
+          <w:szCs w:val="21"/>
+          <w14:ligatures w14:val="none"/>
+        </w:rPr>
+      </w:pPr>
+      <w:r>
+        <w:rPr>
+          <w:rFonts w:ascii="Segoe UI" w:eastAsia="Times New Roman" w:hAnsi="Segoe UI" w:cs="Segoe UI"/>
+          <w:color w:val="202020"/>
+          <w:kern w:val="0"/>
+          <w:sz w:val="21"/>
+          <w:szCs w:val="21"/>
+          <w14:ligatures w14:val="none"/>
+        </w:rPr>
+        <w:t>Actions performed:</w:t>
       </w:r>
     </w:p>
     <w:p>
@@ -4570,7 +4531,7 @@
           <w:szCs w:val="21"/>
           <w14:ligatures w14:val="none"/>
         </w:rPr>
-        <w:t>Delete User</w:t>
+        <w:t>Delete user</w:t>
       </w:r>
     </w:p>
     <w:p>
@@ -4590,8 +4551,8 @@
           <w:kern w:val="0"/>
           <w14:ligatures w14:val="none"/>
         </w:rPr>
-        <w:pict w14:anchorId="58B0E517">
-          <v:rect id="_x0000_i1488" style="width:0;height:.75pt" o:hralign="center" o:hrstd="t" o:hr="t" fillcolor="#a0a0a0" stroked="f"/>
+        <w:pict w14:anchorId="70731882">
+          <v:rect id="_x0000_i1497" style="width:0;height:.75pt" o:hralign="center" o:hrstd="t" o:hr="t" fillcolor="#a0a0a0" stroked="f"/>
         </w:pict>
       </w:r>
     </w:p>
@@ -5008,8 +4969,8 @@
           <w:kern w:val="0"/>
           <w14:ligatures w14:val="none"/>
         </w:rPr>
-        <w:pict w14:anchorId="15519330">
-          <v:rect id="_x0000_i1489" style="width:0;height:.75pt" o:hralign="center" o:hrstd="t" o:hr="t" fillcolor="#a0a0a0" stroked="f"/>
+        <w:pict w14:anchorId="0A801CF4">
+          <v:rect id="_x0000_i1498" style="width:0;height:.75pt" o:hralign="center" o:hrstd="t" o:hr="t" fillcolor="#a0a0a0" stroked="f"/>
         </w:pict>
       </w:r>
     </w:p>
@@ -5259,7 +5220,7 @@
       <w:pPr>
         <w:numPr>
           <w:ilvl w:val="0"/>
-          <w:numId w:val="35"/>
+          <w:numId w:val="43"/>
         </w:numPr>
         <w:spacing w:before="100" w:beforeAutospacing="1" w:after="100" w:afterAutospacing="1" w:line="240" w:lineRule="auto"/>
         <w:rPr>
@@ -5287,7 +5248,7 @@
       <w:pPr>
         <w:numPr>
           <w:ilvl w:val="0"/>
-          <w:numId w:val="35"/>
+          <w:numId w:val="43"/>
         </w:numPr>
         <w:spacing w:before="100" w:beforeAutospacing="1" w:after="100" w:afterAutospacing="1" w:line="240" w:lineRule="auto"/>
         <w:rPr>
@@ -5315,7 +5276,7 @@
       <w:pPr>
         <w:numPr>
           <w:ilvl w:val="0"/>
-          <w:numId w:val="35"/>
+          <w:numId w:val="43"/>
         </w:numPr>
         <w:spacing w:before="100" w:beforeAutospacing="1" w:after="100" w:afterAutospacing="1" w:line="240" w:lineRule="auto"/>
         <w:rPr>
@@ -5343,7 +5304,7 @@
       <w:pPr>
         <w:numPr>
           <w:ilvl w:val="0"/>
-          <w:numId w:val="35"/>
+          <w:numId w:val="43"/>
         </w:numPr>
         <w:spacing w:before="100" w:beforeAutospacing="1" w:after="100" w:afterAutospacing="1" w:line="240" w:lineRule="auto"/>
         <w:rPr>
@@ -5384,8 +5345,8 @@
           <w:kern w:val="0"/>
           <w14:ligatures w14:val="none"/>
         </w:rPr>
-        <w:pict w14:anchorId="758862EA">
-          <v:rect id="_x0000_i1490" style="width:0;height:.75pt" o:hralign="center" o:hrstd="t" o:hr="t" fillcolor="#a0a0a0" stroked="f"/>
+        <w:pict w14:anchorId="6FE37B81">
+          <v:rect id="_x0000_i1499" style="width:0;height:.75pt" o:hralign="center" o:hrstd="t" o:hr="t" fillcolor="#a0a0a0" stroked="f"/>
         </w:pict>
       </w:r>
     </w:p>
@@ -5880,8 +5841,8 @@
           <w:kern w:val="0"/>
           <w14:ligatures w14:val="none"/>
         </w:rPr>
-        <w:pict w14:anchorId="0C4799FB">
-          <v:rect id="_x0000_i1491" style="width:0;height:.75pt" o:hralign="center" o:hrstd="t" o:hr="t" fillcolor="#a0a0a0" stroked="f"/>
+        <w:pict w14:anchorId="0505ECEB">
+          <v:rect id="_x0000_i1500" style="width:0;height:.75pt" o:hralign="center" o:hrstd="t" o:hr="t" fillcolor="#a0a0a0" stroked="f"/>
         </w:pict>
       </w:r>
     </w:p>
@@ -6657,8 +6618,8 @@
           <w:kern w:val="0"/>
           <w14:ligatures w14:val="none"/>
         </w:rPr>
-        <w:pict w14:anchorId="31EAE61C">
-          <v:rect id="_x0000_i1492" style="width:0;height:.75pt" o:hralign="center" o:hrstd="t" o:hr="t" fillcolor="#a0a0a0" stroked="f"/>
+        <w:pict w14:anchorId="4F5E99F5">
+          <v:rect id="_x0000_i1501" style="width:0;height:.75pt" o:hralign="center" o:hrstd="t" o:hr="t" fillcolor="#a0a0a0" stroked="f"/>
         </w:pict>
       </w:r>
     </w:p>
@@ -7202,8 +7163,8 @@
           <w:kern w:val="0"/>
           <w14:ligatures w14:val="none"/>
         </w:rPr>
-        <w:pict w14:anchorId="1B8A954B">
-          <v:rect id="_x0000_i1493" style="width:0;height:.75pt" o:hralign="center" o:hrstd="t" o:hr="t" fillcolor="#a0a0a0" stroked="f"/>
+        <w:pict w14:anchorId="7B453ABF">
+          <v:rect id="_x0000_i1502" style="width:0;height:.75pt" o:hralign="center" o:hrstd="t" o:hr="t" fillcolor="#a0a0a0" stroked="f"/>
         </w:pict>
       </w:r>
     </w:p>
@@ -7683,8 +7644,8 @@
           <w:kern w:val="0"/>
           <w14:ligatures w14:val="none"/>
         </w:rPr>
-        <w:pict w14:anchorId="2E8E1EE9">
-          <v:rect id="_x0000_i1494" style="width:0;height:.75pt" o:hralign="center" o:hrstd="t" o:hr="t" fillcolor="#a0a0a0" stroked="f"/>
+        <w:pict w14:anchorId="29EB9D0F">
+          <v:rect id="_x0000_i1503" style="width:0;height:.75pt" o:hralign="center" o:hrstd="t" o:hr="t" fillcolor="#a0a0a0" stroked="f"/>
         </w:pict>
       </w:r>
     </w:p>
@@ -8101,8 +8062,8 @@
           <w:kern w:val="0"/>
           <w14:ligatures w14:val="none"/>
         </w:rPr>
-        <w:pict w14:anchorId="1D44A11F">
-          <v:rect id="_x0000_i1495" style="width:0;height:.75pt" o:hralign="center" o:hrstd="t" o:hr="t" fillcolor="#a0a0a0" stroked="f"/>
+        <w:pict w14:anchorId="4EF52309">
+          <v:rect id="_x0000_i1504" style="width:0;height:.75pt" o:hralign="center" o:hrstd="t" o:hr="t" fillcolor="#a0a0a0" stroked="f"/>
         </w:pict>
       </w:r>
     </w:p>
@@ -8518,8 +8479,8 @@
           <w:kern w:val="0"/>
           <w14:ligatures w14:val="none"/>
         </w:rPr>
-        <w:pict w14:anchorId="6CE5D8E2">
-          <v:rect id="_x0000_i1496" style="width:0;height:.75pt" o:hralign="center" o:hrstd="t" o:hr="t" fillcolor="#a0a0a0" stroked="f"/>
+        <w:pict w14:anchorId="2D4E0143">
+          <v:rect id="_x0000_i1505" style="width:0;height:.75pt" o:hralign="center" o:hrstd="t" o:hr="t" fillcolor="#a0a0a0" stroked="f"/>
         </w:pict>
       </w:r>
     </w:p>
@@ -8887,8 +8848,8 @@
           <w:kern w:val="0"/>
           <w14:ligatures w14:val="none"/>
         </w:rPr>
-        <w:pict w14:anchorId="48BE3FE6">
-          <v:rect id="_x0000_i1497" style="width:0;height:.75pt" o:hralign="center" o:hrstd="t" o:hr="t" fillcolor="#a0a0a0" stroked="f"/>
+        <w:pict w14:anchorId="24933DE2">
+          <v:rect id="_x0000_i1506" style="width:0;height:.75pt" o:hralign="center" o:hrstd="t" o:hr="t" fillcolor="#a0a0a0" stroked="f"/>
         </w:pict>
       </w:r>
     </w:p>
@@ -8925,7 +8886,7 @@
       <w:pPr>
         <w:numPr>
           <w:ilvl w:val="0"/>
-          <w:numId w:val="36"/>
+          <w:numId w:val="44"/>
         </w:numPr>
         <w:spacing w:before="100" w:beforeAutospacing="1" w:after="100" w:afterAutospacing="1" w:line="240" w:lineRule="auto"/>
         <w:rPr>
@@ -8953,7 +8914,7 @@
       <w:pPr>
         <w:numPr>
           <w:ilvl w:val="0"/>
-          <w:numId w:val="36"/>
+          <w:numId w:val="44"/>
         </w:numPr>
         <w:spacing w:before="100" w:beforeAutospacing="1" w:after="100" w:afterAutospacing="1" w:line="240" w:lineRule="auto"/>
         <w:rPr>
@@ -8981,7 +8942,7 @@
       <w:pPr>
         <w:numPr>
           <w:ilvl w:val="0"/>
-          <w:numId w:val="36"/>
+          <w:numId w:val="44"/>
         </w:numPr>
         <w:spacing w:before="100" w:beforeAutospacing="1" w:after="100" w:afterAutospacing="1" w:line="240" w:lineRule="auto"/>
         <w:rPr>
@@ -9009,7 +8970,7 @@
       <w:pPr>
         <w:numPr>
           <w:ilvl w:val="0"/>
-          <w:numId w:val="36"/>
+          <w:numId w:val="44"/>
         </w:numPr>
         <w:spacing w:before="100" w:beforeAutospacing="1" w:after="100" w:afterAutospacing="1" w:line="240" w:lineRule="auto"/>
         <w:rPr>
@@ -9037,7 +8998,7 @@
       <w:pPr>
         <w:numPr>
           <w:ilvl w:val="0"/>
-          <w:numId w:val="36"/>
+          <w:numId w:val="44"/>
         </w:numPr>
         <w:spacing w:before="100" w:beforeAutospacing="1" w:after="100" w:afterAutospacing="1" w:line="240" w:lineRule="auto"/>
         <w:rPr>
@@ -9065,7 +9026,7 @@
       <w:pPr>
         <w:numPr>
           <w:ilvl w:val="0"/>
-          <w:numId w:val="36"/>
+          <w:numId w:val="44"/>
         </w:numPr>
         <w:spacing w:before="100" w:beforeAutospacing="1" w:after="100" w:afterAutospacing="1" w:line="240" w:lineRule="auto"/>
         <w:rPr>
@@ -9093,7 +9054,7 @@
       <w:pPr>
         <w:numPr>
           <w:ilvl w:val="0"/>
-          <w:numId w:val="36"/>
+          <w:numId w:val="44"/>
         </w:numPr>
         <w:spacing w:before="100" w:beforeAutospacing="1" w:after="100" w:afterAutospacing="1" w:line="240" w:lineRule="auto"/>
         <w:rPr>
@@ -9134,8 +9095,8 @@
           <w:kern w:val="0"/>
           <w14:ligatures w14:val="none"/>
         </w:rPr>
-        <w:pict w14:anchorId="45A646AD">
-          <v:rect id="_x0000_i1498" style="width:0;height:.75pt" o:hralign="center" o:hrstd="t" o:hr="t" fillcolor="#a0a0a0" stroked="f"/>
+        <w:pict w14:anchorId="3FB9D913">
+          <v:rect id="_x0000_i1507" style="width:0;height:.75pt" o:hralign="center" o:hrstd="t" o:hr="t" fillcolor="#a0a0a0" stroked="f"/>
         </w:pict>
       </w:r>
     </w:p>
@@ -9345,43 +9306,23 @@
       <w:pPr>
         <w:spacing w:after="0" w:line="240" w:lineRule="auto"/>
         <w:rPr>
+          <w:rFonts w:ascii="Segoe UI" w:eastAsia="Times New Roman" w:hAnsi="Segoe UI" w:cs="Segoe UI"/>
+          <w:kern w:val="0"/>
+          <w:sz w:val="21"/>
+          <w:szCs w:val="21"/>
+          <w14:ligatures w14:val="none"/>
+        </w:rPr>
+      </w:pPr>
+      <w:r>
+        <w:rPr>
           <w:rFonts w:ascii="Times New Roman" w:eastAsia="Times New Roman" w:hAnsi="Times New Roman" w:cs="Times New Roman"/>
           <w:kern w:val="0"/>
           <w14:ligatures w14:val="none"/>
         </w:rPr>
-      </w:pPr>
-      <w:r>
-        <w:rPr>
-          <w:rFonts w:ascii="Times New Roman" w:eastAsia="Times New Roman" w:hAnsi="Times New Roman" w:cs="Times New Roman"/>
-          <w:kern w:val="0"/>
-          <w14:ligatures w14:val="none"/>
-        </w:rPr>
-        <w:pict w14:anchorId="16F238D0">
-          <v:rect id="_x0000_i1528" style="width:0;height:.75pt" o:hralign="center" o:bullet="t" o:hrstd="t" o:hr="t" fillcolor="#a0a0a0" stroked="f"/>
+        <w:pict w14:anchorId="57C97CCD">
+          <v:rect id="_x0000_i1508" style="width:0;height:.75pt" o:hralign="center" o:hrstd="t" o:hr="t" fillcolor="#a0a0a0" stroked="f"/>
         </w:pict>
       </w:r>
-    </w:p>
-    <w:p>
-      <w:pPr>
-        <w:spacing w:after="0" w:line="240" w:lineRule="auto"/>
-        <w:rPr>
-          <w:rFonts w:ascii="Times New Roman" w:eastAsia="Times New Roman" w:hAnsi="Times New Roman" w:cs="Times New Roman"/>
-          <w:kern w:val="0"/>
-          <w14:ligatures w14:val="none"/>
-        </w:rPr>
-      </w:pPr>
-    </w:p>
-    <w:p>
-      <w:pPr>
-        <w:spacing w:after="0" w:line="240" w:lineRule="auto"/>
-        <w:rPr>
-          <w:rFonts w:ascii="Segoe UI" w:eastAsia="Times New Roman" w:hAnsi="Segoe UI" w:cs="Segoe UI"/>
-          <w:kern w:val="0"/>
-          <w:sz w:val="21"/>
-          <w:szCs w:val="21"/>
-          <w14:ligatures w14:val="none"/>
-        </w:rPr>
-      </w:pPr>
     </w:p>
     <w:p>
       <w:pPr>
@@ -9409,7 +9350,6 @@
           <w:szCs w:val="48"/>
           <w14:ligatures w14:val="none"/>
         </w:rPr>
-        <w:lastRenderedPageBreak/>
         <w:t>Notes</w:t>
       </w:r>
     </w:p>
@@ -9417,7 +9357,7 @@
       <w:pPr>
         <w:numPr>
           <w:ilvl w:val="0"/>
-          <w:numId w:val="37"/>
+          <w:numId w:val="45"/>
         </w:numPr>
         <w:spacing w:before="100" w:beforeAutospacing="1" w:after="100" w:afterAutospacing="1" w:line="240" w:lineRule="auto"/>
         <w:rPr>
@@ -9438,6 +9378,7 @@
           <w:szCs w:val="21"/>
           <w14:ligatures w14:val="none"/>
         </w:rPr>
+        <w:lastRenderedPageBreak/>
         <w:t>Dry Run is the default mode.</w:t>
       </w:r>
     </w:p>
@@ -9445,7 +9386,7 @@
       <w:pPr>
         <w:numPr>
           <w:ilvl w:val="0"/>
-          <w:numId w:val="37"/>
+          <w:numId w:val="45"/>
         </w:numPr>
         <w:spacing w:before="100" w:beforeAutospacing="1" w:after="100" w:afterAutospacing="1" w:line="240" w:lineRule="auto"/>
         <w:rPr>
@@ -9496,7 +9437,7 @@
       <w:pPr>
         <w:numPr>
           <w:ilvl w:val="0"/>
-          <w:numId w:val="37"/>
+          <w:numId w:val="45"/>
         </w:numPr>
         <w:spacing w:before="100" w:beforeAutospacing="1" w:after="100" w:afterAutospacing="1" w:line="240" w:lineRule="auto"/>
         <w:rPr>
@@ -9524,7 +9465,7 @@
       <w:pPr>
         <w:numPr>
           <w:ilvl w:val="0"/>
-          <w:numId w:val="37"/>
+          <w:numId w:val="45"/>
         </w:numPr>
         <w:spacing w:before="100" w:beforeAutospacing="1" w:after="100" w:afterAutospacing="1" w:line="240" w:lineRule="auto"/>
         <w:rPr>
@@ -9552,7 +9493,7 @@
       <w:pPr>
         <w:numPr>
           <w:ilvl w:val="0"/>
-          <w:numId w:val="37"/>
+          <w:numId w:val="45"/>
         </w:numPr>
         <w:spacing w:before="100" w:beforeAutospacing="1" w:after="100" w:afterAutospacing="1" w:line="240" w:lineRule="auto"/>
         <w:rPr>
@@ -9580,7 +9521,7 @@
       <w:pPr>
         <w:numPr>
           <w:ilvl w:val="0"/>
-          <w:numId w:val="37"/>
+          <w:numId w:val="45"/>
         </w:numPr>
         <w:spacing w:before="100" w:beforeAutospacing="1" w:after="100" w:afterAutospacing="1" w:line="240" w:lineRule="auto"/>
         <w:rPr>
@@ -9608,7 +9549,7 @@
       <w:pPr>
         <w:numPr>
           <w:ilvl w:val="0"/>
-          <w:numId w:val="37"/>
+          <w:numId w:val="45"/>
         </w:numPr>
         <w:spacing w:before="100" w:beforeAutospacing="1" w:after="100" w:afterAutospacing="1" w:line="240" w:lineRule="auto"/>
         <w:rPr>
@@ -11290,6 +11231,268 @@
     </w:lvl>
   </w:abstractNum>
   <w:abstractNum w:abstractNumId="11" w15:restartNumberingAfterBreak="0">
+    <w:nsid w:val="239B3A80"/>
+    <w:multiLevelType w:val="multilevel"/>
+    <w:tmpl w:val="18584B9C"/>
+    <w:lvl w:ilvl="0">
+      <w:start w:val="1"/>
+      <w:numFmt w:val="bullet"/>
+      <w:lvlText w:val=""/>
+      <w:lvlJc w:val="left"/>
+      <w:pPr>
+        <w:tabs>
+          <w:tab w:val="num" w:pos="720"/>
+        </w:tabs>
+        <w:ind w:left="720" w:hanging="360"/>
+      </w:pPr>
+      <w:rPr>
+        <w:rFonts w:ascii="Symbol" w:hAnsi="Symbol" w:hint="default"/>
+        <w:sz w:val="20"/>
+      </w:rPr>
+    </w:lvl>
+    <w:lvl w:ilvl="1" w:tentative="1">
+      <w:start w:val="1"/>
+      <w:numFmt w:val="bullet"/>
+      <w:lvlText w:val="o"/>
+      <w:lvlJc w:val="left"/>
+      <w:pPr>
+        <w:tabs>
+          <w:tab w:val="num" w:pos="1440"/>
+        </w:tabs>
+        <w:ind w:left="1440" w:hanging="360"/>
+      </w:pPr>
+      <w:rPr>
+        <w:rFonts w:ascii="Courier New" w:hAnsi="Courier New" w:hint="default"/>
+        <w:sz w:val="20"/>
+      </w:rPr>
+    </w:lvl>
+    <w:lvl w:ilvl="2" w:tentative="1">
+      <w:start w:val="1"/>
+      <w:numFmt w:val="bullet"/>
+      <w:lvlText w:val=""/>
+      <w:lvlJc w:val="left"/>
+      <w:pPr>
+        <w:tabs>
+          <w:tab w:val="num" w:pos="2160"/>
+        </w:tabs>
+        <w:ind w:left="2160" w:hanging="360"/>
+      </w:pPr>
+      <w:rPr>
+        <w:rFonts w:ascii="Wingdings" w:hAnsi="Wingdings" w:hint="default"/>
+        <w:sz w:val="20"/>
+      </w:rPr>
+    </w:lvl>
+    <w:lvl w:ilvl="3" w:tentative="1">
+      <w:start w:val="1"/>
+      <w:numFmt w:val="bullet"/>
+      <w:lvlText w:val=""/>
+      <w:lvlJc w:val="left"/>
+      <w:pPr>
+        <w:tabs>
+          <w:tab w:val="num" w:pos="2880"/>
+        </w:tabs>
+        <w:ind w:left="2880" w:hanging="360"/>
+      </w:pPr>
+      <w:rPr>
+        <w:rFonts w:ascii="Wingdings" w:hAnsi="Wingdings" w:hint="default"/>
+        <w:sz w:val="20"/>
+      </w:rPr>
+    </w:lvl>
+    <w:lvl w:ilvl="4" w:tentative="1">
+      <w:start w:val="1"/>
+      <w:numFmt w:val="bullet"/>
+      <w:lvlText w:val=""/>
+      <w:lvlJc w:val="left"/>
+      <w:pPr>
+        <w:tabs>
+          <w:tab w:val="num" w:pos="3600"/>
+        </w:tabs>
+        <w:ind w:left="3600" w:hanging="360"/>
+      </w:pPr>
+      <w:rPr>
+        <w:rFonts w:ascii="Wingdings" w:hAnsi="Wingdings" w:hint="default"/>
+        <w:sz w:val="20"/>
+      </w:rPr>
+    </w:lvl>
+    <w:lvl w:ilvl="5" w:tentative="1">
+      <w:start w:val="1"/>
+      <w:numFmt w:val="bullet"/>
+      <w:lvlText w:val=""/>
+      <w:lvlJc w:val="left"/>
+      <w:pPr>
+        <w:tabs>
+          <w:tab w:val="num" w:pos="4320"/>
+        </w:tabs>
+        <w:ind w:left="4320" w:hanging="360"/>
+      </w:pPr>
+      <w:rPr>
+        <w:rFonts w:ascii="Wingdings" w:hAnsi="Wingdings" w:hint="default"/>
+        <w:sz w:val="20"/>
+      </w:rPr>
+    </w:lvl>
+    <w:lvl w:ilvl="6" w:tentative="1">
+      <w:start w:val="1"/>
+      <w:numFmt w:val="bullet"/>
+      <w:lvlText w:val=""/>
+      <w:lvlJc w:val="left"/>
+      <w:pPr>
+        <w:tabs>
+          <w:tab w:val="num" w:pos="5040"/>
+        </w:tabs>
+        <w:ind w:left="5040" w:hanging="360"/>
+      </w:pPr>
+      <w:rPr>
+        <w:rFonts w:ascii="Wingdings" w:hAnsi="Wingdings" w:hint="default"/>
+        <w:sz w:val="20"/>
+      </w:rPr>
+    </w:lvl>
+    <w:lvl w:ilvl="7" w:tentative="1">
+      <w:start w:val="1"/>
+      <w:numFmt w:val="bullet"/>
+      <w:lvlText w:val=""/>
+      <w:lvlJc w:val="left"/>
+      <w:pPr>
+        <w:tabs>
+          <w:tab w:val="num" w:pos="5760"/>
+        </w:tabs>
+        <w:ind w:left="5760" w:hanging="360"/>
+      </w:pPr>
+      <w:rPr>
+        <w:rFonts w:ascii="Wingdings" w:hAnsi="Wingdings" w:hint="default"/>
+        <w:sz w:val="20"/>
+      </w:rPr>
+    </w:lvl>
+    <w:lvl w:ilvl="8" w:tentative="1">
+      <w:start w:val="1"/>
+      <w:numFmt w:val="bullet"/>
+      <w:lvlText w:val=""/>
+      <w:lvlJc w:val="left"/>
+      <w:pPr>
+        <w:tabs>
+          <w:tab w:val="num" w:pos="6480"/>
+        </w:tabs>
+        <w:ind w:left="6480" w:hanging="360"/>
+      </w:pPr>
+      <w:rPr>
+        <w:rFonts w:ascii="Wingdings" w:hAnsi="Wingdings" w:hint="default"/>
+        <w:sz w:val="20"/>
+      </w:rPr>
+    </w:lvl>
+  </w:abstractNum>
+  <w:abstractNum w:abstractNumId="12" w15:restartNumberingAfterBreak="0">
+    <w:nsid w:val="256C48D6"/>
+    <w:multiLevelType w:val="multilevel"/>
+    <w:tmpl w:val="E76009DA"/>
+    <w:lvl w:ilvl="0">
+      <w:start w:val="5"/>
+      <w:numFmt w:val="decimal"/>
+      <w:lvlText w:val="%1."/>
+      <w:lvlJc w:val="left"/>
+      <w:pPr>
+        <w:tabs>
+          <w:tab w:val="num" w:pos="720"/>
+        </w:tabs>
+        <w:ind w:left="720" w:hanging="360"/>
+      </w:pPr>
+    </w:lvl>
+    <w:lvl w:ilvl="1" w:tentative="1">
+      <w:start w:val="1"/>
+      <w:numFmt w:val="decimal"/>
+      <w:lvlText w:val="%2."/>
+      <w:lvlJc w:val="left"/>
+      <w:pPr>
+        <w:tabs>
+          <w:tab w:val="num" w:pos="1440"/>
+        </w:tabs>
+        <w:ind w:left="1440" w:hanging="360"/>
+      </w:pPr>
+    </w:lvl>
+    <w:lvl w:ilvl="2" w:tentative="1">
+      <w:start w:val="1"/>
+      <w:numFmt w:val="decimal"/>
+      <w:lvlText w:val="%3."/>
+      <w:lvlJc w:val="left"/>
+      <w:pPr>
+        <w:tabs>
+          <w:tab w:val="num" w:pos="2160"/>
+        </w:tabs>
+        <w:ind w:left="2160" w:hanging="360"/>
+      </w:pPr>
+    </w:lvl>
+    <w:lvl w:ilvl="3" w:tentative="1">
+      <w:start w:val="1"/>
+      <w:numFmt w:val="decimal"/>
+      <w:lvlText w:val="%4."/>
+      <w:lvlJc w:val="left"/>
+      <w:pPr>
+        <w:tabs>
+          <w:tab w:val="num" w:pos="2880"/>
+        </w:tabs>
+        <w:ind w:left="2880" w:hanging="360"/>
+      </w:pPr>
+    </w:lvl>
+    <w:lvl w:ilvl="4" w:tentative="1">
+      <w:start w:val="1"/>
+      <w:numFmt w:val="decimal"/>
+      <w:lvlText w:val="%5."/>
+      <w:lvlJc w:val="left"/>
+      <w:pPr>
+        <w:tabs>
+          <w:tab w:val="num" w:pos="3600"/>
+        </w:tabs>
+        <w:ind w:left="3600" w:hanging="360"/>
+      </w:pPr>
+    </w:lvl>
+    <w:lvl w:ilvl="5" w:tentative="1">
+      <w:start w:val="1"/>
+      <w:numFmt w:val="decimal"/>
+      <w:lvlText w:val="%6."/>
+      <w:lvlJc w:val="left"/>
+      <w:pPr>
+        <w:tabs>
+          <w:tab w:val="num" w:pos="4320"/>
+        </w:tabs>
+        <w:ind w:left="4320" w:hanging="360"/>
+      </w:pPr>
+    </w:lvl>
+    <w:lvl w:ilvl="6" w:tentative="1">
+      <w:start w:val="1"/>
+      <w:numFmt w:val="decimal"/>
+      <w:lvlText w:val="%7."/>
+      <w:lvlJc w:val="left"/>
+      <w:pPr>
+        <w:tabs>
+          <w:tab w:val="num" w:pos="5040"/>
+        </w:tabs>
+        <w:ind w:left="5040" w:hanging="360"/>
+      </w:pPr>
+    </w:lvl>
+    <w:lvl w:ilvl="7" w:tentative="1">
+      <w:start w:val="1"/>
+      <w:numFmt w:val="decimal"/>
+      <w:lvlText w:val="%8."/>
+      <w:lvlJc w:val="left"/>
+      <w:pPr>
+        <w:tabs>
+          <w:tab w:val="num" w:pos="5760"/>
+        </w:tabs>
+        <w:ind w:left="5760" w:hanging="360"/>
+      </w:pPr>
+    </w:lvl>
+    <w:lvl w:ilvl="8" w:tentative="1">
+      <w:start w:val="1"/>
+      <w:numFmt w:val="decimal"/>
+      <w:lvlText w:val="%9."/>
+      <w:lvlJc w:val="left"/>
+      <w:pPr>
+        <w:tabs>
+          <w:tab w:val="num" w:pos="6480"/>
+        </w:tabs>
+        <w:ind w:left="6480" w:hanging="360"/>
+      </w:pPr>
+    </w:lvl>
+  </w:abstractNum>
+  <w:abstractNum w:abstractNumId="13" w15:restartNumberingAfterBreak="0">
     <w:nsid w:val="31F70815"/>
     <w:multiLevelType w:val="multilevel"/>
     <w:tmpl w:val="807EE204"/>
@@ -11438,7 +11641,120 @@
       </w:rPr>
     </w:lvl>
   </w:abstractNum>
-  <w:abstractNum w:abstractNumId="12" w15:restartNumberingAfterBreak="0">
+  <w:abstractNum w:abstractNumId="14" w15:restartNumberingAfterBreak="0">
+    <w:nsid w:val="327C6B21"/>
+    <w:multiLevelType w:val="multilevel"/>
+    <w:tmpl w:val="43A0A260"/>
+    <w:lvl w:ilvl="0">
+      <w:start w:val="1"/>
+      <w:numFmt w:val="decimal"/>
+      <w:lvlText w:val="%1."/>
+      <w:lvlJc w:val="left"/>
+      <w:pPr>
+        <w:tabs>
+          <w:tab w:val="num" w:pos="720"/>
+        </w:tabs>
+        <w:ind w:left="720" w:hanging="360"/>
+      </w:pPr>
+    </w:lvl>
+    <w:lvl w:ilvl="1" w:tentative="1">
+      <w:start w:val="1"/>
+      <w:numFmt w:val="decimal"/>
+      <w:lvlText w:val="%2."/>
+      <w:lvlJc w:val="left"/>
+      <w:pPr>
+        <w:tabs>
+          <w:tab w:val="num" w:pos="1440"/>
+        </w:tabs>
+        <w:ind w:left="1440" w:hanging="360"/>
+      </w:pPr>
+    </w:lvl>
+    <w:lvl w:ilvl="2" w:tentative="1">
+      <w:start w:val="1"/>
+      <w:numFmt w:val="decimal"/>
+      <w:lvlText w:val="%3."/>
+      <w:lvlJc w:val="left"/>
+      <w:pPr>
+        <w:tabs>
+          <w:tab w:val="num" w:pos="2160"/>
+        </w:tabs>
+        <w:ind w:left="2160" w:hanging="360"/>
+      </w:pPr>
+    </w:lvl>
+    <w:lvl w:ilvl="3" w:tentative="1">
+      <w:start w:val="1"/>
+      <w:numFmt w:val="decimal"/>
+      <w:lvlText w:val="%4."/>
+      <w:lvlJc w:val="left"/>
+      <w:pPr>
+        <w:tabs>
+          <w:tab w:val="num" w:pos="2880"/>
+        </w:tabs>
+        <w:ind w:left="2880" w:hanging="360"/>
+      </w:pPr>
+    </w:lvl>
+    <w:lvl w:ilvl="4" w:tentative="1">
+      <w:start w:val="1"/>
+      <w:numFmt w:val="decimal"/>
+      <w:lvlText w:val="%5."/>
+      <w:lvlJc w:val="left"/>
+      <w:pPr>
+        <w:tabs>
+          <w:tab w:val="num" w:pos="3600"/>
+        </w:tabs>
+        <w:ind w:left="3600" w:hanging="360"/>
+      </w:pPr>
+    </w:lvl>
+    <w:lvl w:ilvl="5" w:tentative="1">
+      <w:start w:val="1"/>
+      <w:numFmt w:val="decimal"/>
+      <w:lvlText w:val="%6."/>
+      <w:lvlJc w:val="left"/>
+      <w:pPr>
+        <w:tabs>
+          <w:tab w:val="num" w:pos="4320"/>
+        </w:tabs>
+        <w:ind w:left="4320" w:hanging="360"/>
+      </w:pPr>
+    </w:lvl>
+    <w:lvl w:ilvl="6" w:tentative="1">
+      <w:start w:val="1"/>
+      <w:numFmt w:val="decimal"/>
+      <w:lvlText w:val="%7."/>
+      <w:lvlJc w:val="left"/>
+      <w:pPr>
+        <w:tabs>
+          <w:tab w:val="num" w:pos="5040"/>
+        </w:tabs>
+        <w:ind w:left="5040" w:hanging="360"/>
+      </w:pPr>
+    </w:lvl>
+    <w:lvl w:ilvl="7" w:tentative="1">
+      <w:start w:val="1"/>
+      <w:numFmt w:val="decimal"/>
+      <w:lvlText w:val="%8."/>
+      <w:lvlJc w:val="left"/>
+      <w:pPr>
+        <w:tabs>
+          <w:tab w:val="num" w:pos="5760"/>
+        </w:tabs>
+        <w:ind w:left="5760" w:hanging="360"/>
+      </w:pPr>
+    </w:lvl>
+    <w:lvl w:ilvl="8" w:tentative="1">
+      <w:start w:val="1"/>
+      <w:numFmt w:val="decimal"/>
+      <w:lvlText w:val="%9."/>
+      <w:lvlJc w:val="left"/>
+      <w:pPr>
+        <w:tabs>
+          <w:tab w:val="num" w:pos="6480"/>
+        </w:tabs>
+        <w:ind w:left="6480" w:hanging="360"/>
+      </w:pPr>
+    </w:lvl>
+  </w:abstractNum>
+  <w:abstractNum w:abstractNumId="15" w15:restartNumberingAfterBreak="0">
     <w:nsid w:val="39C45057"/>
     <w:multiLevelType w:val="multilevel"/>
     <w:tmpl w:val="C8D4059A"/>
@@ -11587,7 +11903,7 @@
       </w:rPr>
     </w:lvl>
   </w:abstractNum>
-  <w:abstractNum w:abstractNumId="13" w15:restartNumberingAfterBreak="0">
+  <w:abstractNum w:abstractNumId="16" w15:restartNumberingAfterBreak="0">
     <w:nsid w:val="3A4B0B7D"/>
     <w:multiLevelType w:val="multilevel"/>
     <w:tmpl w:val="CEF8846C"/>
@@ -11736,7 +12052,7 @@
       </w:rPr>
     </w:lvl>
   </w:abstractNum>
-  <w:abstractNum w:abstractNumId="14" w15:restartNumberingAfterBreak="0">
+  <w:abstractNum w:abstractNumId="17" w15:restartNumberingAfterBreak="0">
     <w:nsid w:val="3A5E76F5"/>
     <w:multiLevelType w:val="multilevel"/>
     <w:tmpl w:val="D3AABC88"/>
@@ -11885,7 +12201,7 @@
       </w:rPr>
     </w:lvl>
   </w:abstractNum>
-  <w:abstractNum w:abstractNumId="15" w15:restartNumberingAfterBreak="0">
+  <w:abstractNum w:abstractNumId="18" w15:restartNumberingAfterBreak="0">
     <w:nsid w:val="3DC85E9B"/>
     <w:multiLevelType w:val="multilevel"/>
     <w:tmpl w:val="656677EE"/>
@@ -12034,7 +12350,7 @@
       </w:rPr>
     </w:lvl>
   </w:abstractNum>
-  <w:abstractNum w:abstractNumId="16" w15:restartNumberingAfterBreak="0">
+  <w:abstractNum w:abstractNumId="19" w15:restartNumberingAfterBreak="0">
     <w:nsid w:val="40FB2022"/>
     <w:multiLevelType w:val="multilevel"/>
     <w:tmpl w:val="D7E64A7A"/>
@@ -12183,7 +12499,7 @@
       </w:rPr>
     </w:lvl>
   </w:abstractNum>
-  <w:abstractNum w:abstractNumId="17" w15:restartNumberingAfterBreak="0">
+  <w:abstractNum w:abstractNumId="20" w15:restartNumberingAfterBreak="0">
     <w:nsid w:val="439E38AF"/>
     <w:multiLevelType w:val="multilevel"/>
     <w:tmpl w:val="8AAEB3E4"/>
@@ -12332,7 +12648,7 @@
       </w:rPr>
     </w:lvl>
   </w:abstractNum>
-  <w:abstractNum w:abstractNumId="18" w15:restartNumberingAfterBreak="0">
+  <w:abstractNum w:abstractNumId="21" w15:restartNumberingAfterBreak="0">
     <w:nsid w:val="44D9696C"/>
     <w:multiLevelType w:val="multilevel"/>
     <w:tmpl w:val="53B0E0B6"/>
@@ -12481,7 +12797,7 @@
       </w:rPr>
     </w:lvl>
   </w:abstractNum>
-  <w:abstractNum w:abstractNumId="19" w15:restartNumberingAfterBreak="0">
+  <w:abstractNum w:abstractNumId="22" w15:restartNumberingAfterBreak="0">
     <w:nsid w:val="453E18B2"/>
     <w:multiLevelType w:val="multilevel"/>
     <w:tmpl w:val="1528F69C"/>
@@ -12630,7 +12946,7 @@
       </w:rPr>
     </w:lvl>
   </w:abstractNum>
-  <w:abstractNum w:abstractNumId="20" w15:restartNumberingAfterBreak="0">
+  <w:abstractNum w:abstractNumId="23" w15:restartNumberingAfterBreak="0">
     <w:nsid w:val="45952182"/>
     <w:multiLevelType w:val="multilevel"/>
     <w:tmpl w:val="781AEA1C"/>
@@ -12779,7 +13095,305 @@
       </w:rPr>
     </w:lvl>
   </w:abstractNum>
-  <w:abstractNum w:abstractNumId="21" w15:restartNumberingAfterBreak="0">
+  <w:abstractNum w:abstractNumId="24" w15:restartNumberingAfterBreak="0">
+    <w:nsid w:val="492F5EE2"/>
+    <w:multiLevelType w:val="multilevel"/>
+    <w:tmpl w:val="B36E2F36"/>
+    <w:lvl w:ilvl="0">
+      <w:start w:val="1"/>
+      <w:numFmt w:val="bullet"/>
+      <w:lvlText w:val=""/>
+      <w:lvlJc w:val="left"/>
+      <w:pPr>
+        <w:tabs>
+          <w:tab w:val="num" w:pos="720"/>
+        </w:tabs>
+        <w:ind w:left="720" w:hanging="360"/>
+      </w:pPr>
+      <w:rPr>
+        <w:rFonts w:ascii="Symbol" w:hAnsi="Symbol" w:hint="default"/>
+        <w:sz w:val="20"/>
+      </w:rPr>
+    </w:lvl>
+    <w:lvl w:ilvl="1" w:tentative="1">
+      <w:start w:val="1"/>
+      <w:numFmt w:val="bullet"/>
+      <w:lvlText w:val="o"/>
+      <w:lvlJc w:val="left"/>
+      <w:pPr>
+        <w:tabs>
+          <w:tab w:val="num" w:pos="1440"/>
+        </w:tabs>
+        <w:ind w:left="1440" w:hanging="360"/>
+      </w:pPr>
+      <w:rPr>
+        <w:rFonts w:ascii="Courier New" w:hAnsi="Courier New" w:hint="default"/>
+        <w:sz w:val="20"/>
+      </w:rPr>
+    </w:lvl>
+    <w:lvl w:ilvl="2" w:tentative="1">
+      <w:start w:val="1"/>
+      <w:numFmt w:val="bullet"/>
+      <w:lvlText w:val=""/>
+      <w:lvlJc w:val="left"/>
+      <w:pPr>
+        <w:tabs>
+          <w:tab w:val="num" w:pos="2160"/>
+        </w:tabs>
+        <w:ind w:left="2160" w:hanging="360"/>
+      </w:pPr>
+      <w:rPr>
+        <w:rFonts w:ascii="Wingdings" w:hAnsi="Wingdings" w:hint="default"/>
+        <w:sz w:val="20"/>
+      </w:rPr>
+    </w:lvl>
+    <w:lvl w:ilvl="3" w:tentative="1">
+      <w:start w:val="1"/>
+      <w:numFmt w:val="bullet"/>
+      <w:lvlText w:val=""/>
+      <w:lvlJc w:val="left"/>
+      <w:pPr>
+        <w:tabs>
+          <w:tab w:val="num" w:pos="2880"/>
+        </w:tabs>
+        <w:ind w:left="2880" w:hanging="360"/>
+      </w:pPr>
+      <w:rPr>
+        <w:rFonts w:ascii="Wingdings" w:hAnsi="Wingdings" w:hint="default"/>
+        <w:sz w:val="20"/>
+      </w:rPr>
+    </w:lvl>
+    <w:lvl w:ilvl="4" w:tentative="1">
+      <w:start w:val="1"/>
+      <w:numFmt w:val="bullet"/>
+      <w:lvlText w:val=""/>
+      <w:lvlJc w:val="left"/>
+      <w:pPr>
+        <w:tabs>
+          <w:tab w:val="num" w:pos="3600"/>
+        </w:tabs>
+        <w:ind w:left="3600" w:hanging="360"/>
+      </w:pPr>
+      <w:rPr>
+        <w:rFonts w:ascii="Wingdings" w:hAnsi="Wingdings" w:hint="default"/>
+        <w:sz w:val="20"/>
+      </w:rPr>
+    </w:lvl>
+    <w:lvl w:ilvl="5" w:tentative="1">
+      <w:start w:val="1"/>
+      <w:numFmt w:val="bullet"/>
+      <w:lvlText w:val=""/>
+      <w:lvlJc w:val="left"/>
+      <w:pPr>
+        <w:tabs>
+          <w:tab w:val="num" w:pos="4320"/>
+        </w:tabs>
+        <w:ind w:left="4320" w:hanging="360"/>
+      </w:pPr>
+      <w:rPr>
+        <w:rFonts w:ascii="Wingdings" w:hAnsi="Wingdings" w:hint="default"/>
+        <w:sz w:val="20"/>
+      </w:rPr>
+    </w:lvl>
+    <w:lvl w:ilvl="6" w:tentative="1">
+      <w:start w:val="1"/>
+      <w:numFmt w:val="bullet"/>
+      <w:lvlText w:val=""/>
+      <w:lvlJc w:val="left"/>
+      <w:pPr>
+        <w:tabs>
+          <w:tab w:val="num" w:pos="5040"/>
+        </w:tabs>
+        <w:ind w:left="5040" w:hanging="360"/>
+      </w:pPr>
+      <w:rPr>
+        <w:rFonts w:ascii="Wingdings" w:hAnsi="Wingdings" w:hint="default"/>
+        <w:sz w:val="20"/>
+      </w:rPr>
+    </w:lvl>
+    <w:lvl w:ilvl="7" w:tentative="1">
+      <w:start w:val="1"/>
+      <w:numFmt w:val="bullet"/>
+      <w:lvlText w:val=""/>
+      <w:lvlJc w:val="left"/>
+      <w:pPr>
+        <w:tabs>
+          <w:tab w:val="num" w:pos="5760"/>
+        </w:tabs>
+        <w:ind w:left="5760" w:hanging="360"/>
+      </w:pPr>
+      <w:rPr>
+        <w:rFonts w:ascii="Wingdings" w:hAnsi="Wingdings" w:hint="default"/>
+        <w:sz w:val="20"/>
+      </w:rPr>
+    </w:lvl>
+    <w:lvl w:ilvl="8" w:tentative="1">
+      <w:start w:val="1"/>
+      <w:numFmt w:val="bullet"/>
+      <w:lvlText w:val=""/>
+      <w:lvlJc w:val="left"/>
+      <w:pPr>
+        <w:tabs>
+          <w:tab w:val="num" w:pos="6480"/>
+        </w:tabs>
+        <w:ind w:left="6480" w:hanging="360"/>
+      </w:pPr>
+      <w:rPr>
+        <w:rFonts w:ascii="Wingdings" w:hAnsi="Wingdings" w:hint="default"/>
+        <w:sz w:val="20"/>
+      </w:rPr>
+    </w:lvl>
+  </w:abstractNum>
+  <w:abstractNum w:abstractNumId="25" w15:restartNumberingAfterBreak="0">
+    <w:nsid w:val="4C273C6D"/>
+    <w:multiLevelType w:val="multilevel"/>
+    <w:tmpl w:val="C4DA72D6"/>
+    <w:lvl w:ilvl="0">
+      <w:start w:val="1"/>
+      <w:numFmt w:val="bullet"/>
+      <w:lvlText w:val=""/>
+      <w:lvlJc w:val="left"/>
+      <w:pPr>
+        <w:tabs>
+          <w:tab w:val="num" w:pos="720"/>
+        </w:tabs>
+        <w:ind w:left="720" w:hanging="360"/>
+      </w:pPr>
+      <w:rPr>
+        <w:rFonts w:ascii="Symbol" w:hAnsi="Symbol" w:hint="default"/>
+        <w:sz w:val="20"/>
+      </w:rPr>
+    </w:lvl>
+    <w:lvl w:ilvl="1" w:tentative="1">
+      <w:start w:val="1"/>
+      <w:numFmt w:val="bullet"/>
+      <w:lvlText w:val="o"/>
+      <w:lvlJc w:val="left"/>
+      <w:pPr>
+        <w:tabs>
+          <w:tab w:val="num" w:pos="1440"/>
+        </w:tabs>
+        <w:ind w:left="1440" w:hanging="360"/>
+      </w:pPr>
+      <w:rPr>
+        <w:rFonts w:ascii="Courier New" w:hAnsi="Courier New" w:hint="default"/>
+        <w:sz w:val="20"/>
+      </w:rPr>
+    </w:lvl>
+    <w:lvl w:ilvl="2" w:tentative="1">
+      <w:start w:val="1"/>
+      <w:numFmt w:val="bullet"/>
+      <w:lvlText w:val=""/>
+      <w:lvlJc w:val="left"/>
+      <w:pPr>
+        <w:tabs>
+          <w:tab w:val="num" w:pos="2160"/>
+        </w:tabs>
+        <w:ind w:left="2160" w:hanging="360"/>
+      </w:pPr>
+      <w:rPr>
+        <w:rFonts w:ascii="Wingdings" w:hAnsi="Wingdings" w:hint="default"/>
+        <w:sz w:val="20"/>
+      </w:rPr>
+    </w:lvl>
+    <w:lvl w:ilvl="3" w:tentative="1">
+      <w:start w:val="1"/>
+      <w:numFmt w:val="bullet"/>
+      <w:lvlText w:val=""/>
+      <w:lvlJc w:val="left"/>
+      <w:pPr>
+        <w:tabs>
+          <w:tab w:val="num" w:pos="2880"/>
+        </w:tabs>
+        <w:ind w:left="2880" w:hanging="360"/>
+      </w:pPr>
+      <w:rPr>
+        <w:rFonts w:ascii="Wingdings" w:hAnsi="Wingdings" w:hint="default"/>
+        <w:sz w:val="20"/>
+      </w:rPr>
+    </w:lvl>
+    <w:lvl w:ilvl="4" w:tentative="1">
+      <w:start w:val="1"/>
+      <w:numFmt w:val="bullet"/>
+      <w:lvlText w:val=""/>
+      <w:lvlJc w:val="left"/>
+      <w:pPr>
+        <w:tabs>
+          <w:tab w:val="num" w:pos="3600"/>
+        </w:tabs>
+        <w:ind w:left="3600" w:hanging="360"/>
+      </w:pPr>
+      <w:rPr>
+        <w:rFonts w:ascii="Wingdings" w:hAnsi="Wingdings" w:hint="default"/>
+        <w:sz w:val="20"/>
+      </w:rPr>
+    </w:lvl>
+    <w:lvl w:ilvl="5" w:tentative="1">
+      <w:start w:val="1"/>
+      <w:numFmt w:val="bullet"/>
+      <w:lvlText w:val=""/>
+      <w:lvlJc w:val="left"/>
+      <w:pPr>
+        <w:tabs>
+          <w:tab w:val="num" w:pos="4320"/>
+        </w:tabs>
+        <w:ind w:left="4320" w:hanging="360"/>
+      </w:pPr>
+      <w:rPr>
+        <w:rFonts w:ascii="Wingdings" w:hAnsi="Wingdings" w:hint="default"/>
+        <w:sz w:val="20"/>
+      </w:rPr>
+    </w:lvl>
+    <w:lvl w:ilvl="6" w:tentative="1">
+      <w:start w:val="1"/>
+      <w:numFmt w:val="bullet"/>
+      <w:lvlText w:val=""/>
+      <w:lvlJc w:val="left"/>
+      <w:pPr>
+        <w:tabs>
+          <w:tab w:val="num" w:pos="5040"/>
+        </w:tabs>
+        <w:ind w:left="5040" w:hanging="360"/>
+      </w:pPr>
+      <w:rPr>
+        <w:rFonts w:ascii="Wingdings" w:hAnsi="Wingdings" w:hint="default"/>
+        <w:sz w:val="20"/>
+      </w:rPr>
+    </w:lvl>
+    <w:lvl w:ilvl="7" w:tentative="1">
+      <w:start w:val="1"/>
+      <w:numFmt w:val="bullet"/>
+      <w:lvlText w:val=""/>
+      <w:lvlJc w:val="left"/>
+      <w:pPr>
+        <w:tabs>
+          <w:tab w:val="num" w:pos="5760"/>
+        </w:tabs>
+        <w:ind w:left="5760" w:hanging="360"/>
+      </w:pPr>
+      <w:rPr>
+        <w:rFonts w:ascii="Wingdings" w:hAnsi="Wingdings" w:hint="default"/>
+        <w:sz w:val="20"/>
+      </w:rPr>
+    </w:lvl>
+    <w:lvl w:ilvl="8" w:tentative="1">
+      <w:start w:val="1"/>
+      <w:numFmt w:val="bullet"/>
+      <w:lvlText w:val=""/>
+      <w:lvlJc w:val="left"/>
+      <w:pPr>
+        <w:tabs>
+          <w:tab w:val="num" w:pos="6480"/>
+        </w:tabs>
+        <w:ind w:left="6480" w:hanging="360"/>
+      </w:pPr>
+      <w:rPr>
+        <w:rFonts w:ascii="Wingdings" w:hAnsi="Wingdings" w:hint="default"/>
+        <w:sz w:val="20"/>
+      </w:rPr>
+    </w:lvl>
+  </w:abstractNum>
+  <w:abstractNum w:abstractNumId="26" w15:restartNumberingAfterBreak="0">
     <w:nsid w:val="4DF91A30"/>
     <w:multiLevelType w:val="multilevel"/>
     <w:tmpl w:val="95543586"/>
@@ -12928,7 +13542,7 @@
       </w:rPr>
     </w:lvl>
   </w:abstractNum>
-  <w:abstractNum w:abstractNumId="22" w15:restartNumberingAfterBreak="0">
+  <w:abstractNum w:abstractNumId="27" w15:restartNumberingAfterBreak="0">
     <w:nsid w:val="4E7D481A"/>
     <w:multiLevelType w:val="multilevel"/>
     <w:tmpl w:val="A992B3F0"/>
@@ -13077,7 +13691,156 @@
       </w:rPr>
     </w:lvl>
   </w:abstractNum>
-  <w:abstractNum w:abstractNumId="23" w15:restartNumberingAfterBreak="0">
+  <w:abstractNum w:abstractNumId="28" w15:restartNumberingAfterBreak="0">
+    <w:nsid w:val="4F3E4D74"/>
+    <w:multiLevelType w:val="multilevel"/>
+    <w:tmpl w:val="5874F0C0"/>
+    <w:lvl w:ilvl="0">
+      <w:start w:val="1"/>
+      <w:numFmt w:val="bullet"/>
+      <w:lvlText w:val=""/>
+      <w:lvlJc w:val="left"/>
+      <w:pPr>
+        <w:tabs>
+          <w:tab w:val="num" w:pos="720"/>
+        </w:tabs>
+        <w:ind w:left="720" w:hanging="360"/>
+      </w:pPr>
+      <w:rPr>
+        <w:rFonts w:ascii="Symbol" w:hAnsi="Symbol" w:hint="default"/>
+        <w:sz w:val="20"/>
+      </w:rPr>
+    </w:lvl>
+    <w:lvl w:ilvl="1" w:tentative="1">
+      <w:start w:val="1"/>
+      <w:numFmt w:val="bullet"/>
+      <w:lvlText w:val="o"/>
+      <w:lvlJc w:val="left"/>
+      <w:pPr>
+        <w:tabs>
+          <w:tab w:val="num" w:pos="1440"/>
+        </w:tabs>
+        <w:ind w:left="1440" w:hanging="360"/>
+      </w:pPr>
+      <w:rPr>
+        <w:rFonts w:ascii="Courier New" w:hAnsi="Courier New" w:hint="default"/>
+        <w:sz w:val="20"/>
+      </w:rPr>
+    </w:lvl>
+    <w:lvl w:ilvl="2" w:tentative="1">
+      <w:start w:val="1"/>
+      <w:numFmt w:val="bullet"/>
+      <w:lvlText w:val=""/>
+      <w:lvlJc w:val="left"/>
+      <w:pPr>
+        <w:tabs>
+          <w:tab w:val="num" w:pos="2160"/>
+        </w:tabs>
+        <w:ind w:left="2160" w:hanging="360"/>
+      </w:pPr>
+      <w:rPr>
+        <w:rFonts w:ascii="Wingdings" w:hAnsi="Wingdings" w:hint="default"/>
+        <w:sz w:val="20"/>
+      </w:rPr>
+    </w:lvl>
+    <w:lvl w:ilvl="3" w:tentative="1">
+      <w:start w:val="1"/>
+      <w:numFmt w:val="bullet"/>
+      <w:lvlText w:val=""/>
+      <w:lvlJc w:val="left"/>
+      <w:pPr>
+        <w:tabs>
+          <w:tab w:val="num" w:pos="2880"/>
+        </w:tabs>
+        <w:ind w:left="2880" w:hanging="360"/>
+      </w:pPr>
+      <w:rPr>
+        <w:rFonts w:ascii="Wingdings" w:hAnsi="Wingdings" w:hint="default"/>
+        <w:sz w:val="20"/>
+      </w:rPr>
+    </w:lvl>
+    <w:lvl w:ilvl="4" w:tentative="1">
+      <w:start w:val="1"/>
+      <w:numFmt w:val="bullet"/>
+      <w:lvlText w:val=""/>
+      <w:lvlJc w:val="left"/>
+      <w:pPr>
+        <w:tabs>
+          <w:tab w:val="num" w:pos="3600"/>
+        </w:tabs>
+        <w:ind w:left="3600" w:hanging="360"/>
+      </w:pPr>
+      <w:rPr>
+        <w:rFonts w:ascii="Wingdings" w:hAnsi="Wingdings" w:hint="default"/>
+        <w:sz w:val="20"/>
+      </w:rPr>
+    </w:lvl>
+    <w:lvl w:ilvl="5" w:tentative="1">
+      <w:start w:val="1"/>
+      <w:numFmt w:val="bullet"/>
+      <w:lvlText w:val=""/>
+      <w:lvlJc w:val="left"/>
+      <w:pPr>
+        <w:tabs>
+          <w:tab w:val="num" w:pos="4320"/>
+        </w:tabs>
+        <w:ind w:left="4320" w:hanging="360"/>
+      </w:pPr>
+      <w:rPr>
+        <w:rFonts w:ascii="Wingdings" w:hAnsi="Wingdings" w:hint="default"/>
+        <w:sz w:val="20"/>
+      </w:rPr>
+    </w:lvl>
+    <w:lvl w:ilvl="6" w:tentative="1">
+      <w:start w:val="1"/>
+      <w:numFmt w:val="bullet"/>
+      <w:lvlText w:val=""/>
+      <w:lvlJc w:val="left"/>
+      <w:pPr>
+        <w:tabs>
+          <w:tab w:val="num" w:pos="5040"/>
+        </w:tabs>
+        <w:ind w:left="5040" w:hanging="360"/>
+      </w:pPr>
+      <w:rPr>
+        <w:rFonts w:ascii="Wingdings" w:hAnsi="Wingdings" w:hint="default"/>
+        <w:sz w:val="20"/>
+      </w:rPr>
+    </w:lvl>
+    <w:lvl w:ilvl="7" w:tentative="1">
+      <w:start w:val="1"/>
+      <w:numFmt w:val="bullet"/>
+      <w:lvlText w:val=""/>
+      <w:lvlJc w:val="left"/>
+      <w:pPr>
+        <w:tabs>
+          <w:tab w:val="num" w:pos="5760"/>
+        </w:tabs>
+        <w:ind w:left="5760" w:hanging="360"/>
+      </w:pPr>
+      <w:rPr>
+        <w:rFonts w:ascii="Wingdings" w:hAnsi="Wingdings" w:hint="default"/>
+        <w:sz w:val="20"/>
+      </w:rPr>
+    </w:lvl>
+    <w:lvl w:ilvl="8" w:tentative="1">
+      <w:start w:val="1"/>
+      <w:numFmt w:val="bullet"/>
+      <w:lvlText w:val=""/>
+      <w:lvlJc w:val="left"/>
+      <w:pPr>
+        <w:tabs>
+          <w:tab w:val="num" w:pos="6480"/>
+        </w:tabs>
+        <w:ind w:left="6480" w:hanging="360"/>
+      </w:pPr>
+      <w:rPr>
+        <w:rFonts w:ascii="Wingdings" w:hAnsi="Wingdings" w:hint="default"/>
+        <w:sz w:val="20"/>
+      </w:rPr>
+    </w:lvl>
+  </w:abstractNum>
+  <w:abstractNum w:abstractNumId="29" w15:restartNumberingAfterBreak="0">
     <w:nsid w:val="4F9B2632"/>
     <w:multiLevelType w:val="multilevel"/>
     <w:tmpl w:val="E6FE36CE"/>
@@ -13226,7 +13989,7 @@
       </w:rPr>
     </w:lvl>
   </w:abstractNum>
-  <w:abstractNum w:abstractNumId="24" w15:restartNumberingAfterBreak="0">
+  <w:abstractNum w:abstractNumId="30" w15:restartNumberingAfterBreak="0">
     <w:nsid w:val="525B3895"/>
     <w:multiLevelType w:val="multilevel"/>
     <w:tmpl w:val="B8DC6848"/>
@@ -13375,7 +14138,7 @@
       </w:rPr>
     </w:lvl>
   </w:abstractNum>
-  <w:abstractNum w:abstractNumId="25" w15:restartNumberingAfterBreak="0">
+  <w:abstractNum w:abstractNumId="31" w15:restartNumberingAfterBreak="0">
     <w:nsid w:val="534B1B94"/>
     <w:multiLevelType w:val="multilevel"/>
     <w:tmpl w:val="59826D1A"/>
@@ -13488,7 +14251,7 @@
       </w:pPr>
     </w:lvl>
   </w:abstractNum>
-  <w:abstractNum w:abstractNumId="26" w15:restartNumberingAfterBreak="0">
+  <w:abstractNum w:abstractNumId="32" w15:restartNumberingAfterBreak="0">
     <w:nsid w:val="540F19D1"/>
     <w:multiLevelType w:val="multilevel"/>
     <w:tmpl w:val="5BB22D3A"/>
@@ -13637,7 +14400,7 @@
       </w:rPr>
     </w:lvl>
   </w:abstractNum>
-  <w:abstractNum w:abstractNumId="27" w15:restartNumberingAfterBreak="0">
+  <w:abstractNum w:abstractNumId="33" w15:restartNumberingAfterBreak="0">
     <w:nsid w:val="5A007A6A"/>
     <w:multiLevelType w:val="multilevel"/>
     <w:tmpl w:val="1EDE8786"/>
@@ -13786,7 +14549,7 @@
       </w:rPr>
     </w:lvl>
   </w:abstractNum>
-  <w:abstractNum w:abstractNumId="28" w15:restartNumberingAfterBreak="0">
+  <w:abstractNum w:abstractNumId="34" w15:restartNumberingAfterBreak="0">
     <w:nsid w:val="5C992328"/>
     <w:multiLevelType w:val="multilevel"/>
     <w:tmpl w:val="FE7A13C8"/>
@@ -13935,7 +14698,120 @@
       </w:rPr>
     </w:lvl>
   </w:abstractNum>
-  <w:abstractNum w:abstractNumId="29" w15:restartNumberingAfterBreak="0">
+  <w:abstractNum w:abstractNumId="35" w15:restartNumberingAfterBreak="0">
+    <w:nsid w:val="5EB17A46"/>
+    <w:multiLevelType w:val="multilevel"/>
+    <w:tmpl w:val="5B36BDFA"/>
+    <w:lvl w:ilvl="0">
+      <w:start w:val="1"/>
+      <w:numFmt w:val="decimal"/>
+      <w:lvlText w:val="%1."/>
+      <w:lvlJc w:val="left"/>
+      <w:pPr>
+        <w:tabs>
+          <w:tab w:val="num" w:pos="720"/>
+        </w:tabs>
+        <w:ind w:left="720" w:hanging="360"/>
+      </w:pPr>
+    </w:lvl>
+    <w:lvl w:ilvl="1" w:tentative="1">
+      <w:start w:val="1"/>
+      <w:numFmt w:val="decimal"/>
+      <w:lvlText w:val="%2."/>
+      <w:lvlJc w:val="left"/>
+      <w:pPr>
+        <w:tabs>
+          <w:tab w:val="num" w:pos="1440"/>
+        </w:tabs>
+        <w:ind w:left="1440" w:hanging="360"/>
+      </w:pPr>
+    </w:lvl>
+    <w:lvl w:ilvl="2" w:tentative="1">
+      <w:start w:val="1"/>
+      <w:numFmt w:val="decimal"/>
+      <w:lvlText w:val="%3."/>
+      <w:lvlJc w:val="left"/>
+      <w:pPr>
+        <w:tabs>
+          <w:tab w:val="num" w:pos="2160"/>
+        </w:tabs>
+        <w:ind w:left="2160" w:hanging="360"/>
+      </w:pPr>
+    </w:lvl>
+    <w:lvl w:ilvl="3" w:tentative="1">
+      <w:start w:val="1"/>
+      <w:numFmt w:val="decimal"/>
+      <w:lvlText w:val="%4."/>
+      <w:lvlJc w:val="left"/>
+      <w:pPr>
+        <w:tabs>
+          <w:tab w:val="num" w:pos="2880"/>
+        </w:tabs>
+        <w:ind w:left="2880" w:hanging="360"/>
+      </w:pPr>
+    </w:lvl>
+    <w:lvl w:ilvl="4" w:tentative="1">
+      <w:start w:val="1"/>
+      <w:numFmt w:val="decimal"/>
+      <w:lvlText w:val="%5."/>
+      <w:lvlJc w:val="left"/>
+      <w:pPr>
+        <w:tabs>
+          <w:tab w:val="num" w:pos="3600"/>
+        </w:tabs>
+        <w:ind w:left="3600" w:hanging="360"/>
+      </w:pPr>
+    </w:lvl>
+    <w:lvl w:ilvl="5" w:tentative="1">
+      <w:start w:val="1"/>
+      <w:numFmt w:val="decimal"/>
+      <w:lvlText w:val="%6."/>
+      <w:lvlJc w:val="left"/>
+      <w:pPr>
+        <w:tabs>
+          <w:tab w:val="num" w:pos="4320"/>
+        </w:tabs>
+        <w:ind w:left="4320" w:hanging="360"/>
+      </w:pPr>
+    </w:lvl>
+    <w:lvl w:ilvl="6" w:tentative="1">
+      <w:start w:val="1"/>
+      <w:numFmt w:val="decimal"/>
+      <w:lvlText w:val="%7."/>
+      <w:lvlJc w:val="left"/>
+      <w:pPr>
+        <w:tabs>
+          <w:tab w:val="num" w:pos="5040"/>
+        </w:tabs>
+        <w:ind w:left="5040" w:hanging="360"/>
+      </w:pPr>
+    </w:lvl>
+    <w:lvl w:ilvl="7" w:tentative="1">
+      <w:start w:val="1"/>
+      <w:numFmt w:val="decimal"/>
+      <w:lvlText w:val="%8."/>
+      <w:lvlJc w:val="left"/>
+      <w:pPr>
+        <w:tabs>
+          <w:tab w:val="num" w:pos="5760"/>
+        </w:tabs>
+        <w:ind w:left="5760" w:hanging="360"/>
+      </w:pPr>
+    </w:lvl>
+    <w:lvl w:ilvl="8" w:tentative="1">
+      <w:start w:val="1"/>
+      <w:numFmt w:val="decimal"/>
+      <w:lvlText w:val="%9."/>
+      <w:lvlJc w:val="left"/>
+      <w:pPr>
+        <w:tabs>
+          <w:tab w:val="num" w:pos="6480"/>
+        </w:tabs>
+        <w:ind w:left="6480" w:hanging="360"/>
+      </w:pPr>
+    </w:lvl>
+  </w:abstractNum>
+  <w:abstractNum w:abstractNumId="36" w15:restartNumberingAfterBreak="0">
     <w:nsid w:val="6B2244F5"/>
     <w:multiLevelType w:val="multilevel"/>
     <w:tmpl w:val="501A6EDC"/>
@@ -14084,7 +14960,7 @@
       </w:rPr>
     </w:lvl>
   </w:abstractNum>
-  <w:abstractNum w:abstractNumId="30" w15:restartNumberingAfterBreak="0">
+  <w:abstractNum w:abstractNumId="37" w15:restartNumberingAfterBreak="0">
     <w:nsid w:val="6B4D2629"/>
     <w:multiLevelType w:val="multilevel"/>
     <w:tmpl w:val="398E73B2"/>
@@ -14233,7 +15109,156 @@
       </w:rPr>
     </w:lvl>
   </w:abstractNum>
-  <w:abstractNum w:abstractNumId="31" w15:restartNumberingAfterBreak="0">
+  <w:abstractNum w:abstractNumId="38" w15:restartNumberingAfterBreak="0">
+    <w:nsid w:val="6BE32903"/>
+    <w:multiLevelType w:val="multilevel"/>
+    <w:tmpl w:val="12303FF8"/>
+    <w:lvl w:ilvl="0">
+      <w:start w:val="1"/>
+      <w:numFmt w:val="bullet"/>
+      <w:lvlText w:val=""/>
+      <w:lvlJc w:val="left"/>
+      <w:pPr>
+        <w:tabs>
+          <w:tab w:val="num" w:pos="720"/>
+        </w:tabs>
+        <w:ind w:left="720" w:hanging="360"/>
+      </w:pPr>
+      <w:rPr>
+        <w:rFonts w:ascii="Symbol" w:hAnsi="Symbol" w:hint="default"/>
+        <w:sz w:val="20"/>
+      </w:rPr>
+    </w:lvl>
+    <w:lvl w:ilvl="1" w:tentative="1">
+      <w:start w:val="1"/>
+      <w:numFmt w:val="bullet"/>
+      <w:lvlText w:val="o"/>
+      <w:lvlJc w:val="left"/>
+      <w:pPr>
+        <w:tabs>
+          <w:tab w:val="num" w:pos="1440"/>
+        </w:tabs>
+        <w:ind w:left="1440" w:hanging="360"/>
+      </w:pPr>
+      <w:rPr>
+        <w:rFonts w:ascii="Courier New" w:hAnsi="Courier New" w:hint="default"/>
+        <w:sz w:val="20"/>
+      </w:rPr>
+    </w:lvl>
+    <w:lvl w:ilvl="2" w:tentative="1">
+      <w:start w:val="1"/>
+      <w:numFmt w:val="bullet"/>
+      <w:lvlText w:val=""/>
+      <w:lvlJc w:val="left"/>
+      <w:pPr>
+        <w:tabs>
+          <w:tab w:val="num" w:pos="2160"/>
+        </w:tabs>
+        <w:ind w:left="2160" w:hanging="360"/>
+      </w:pPr>
+      <w:rPr>
+        <w:rFonts w:ascii="Wingdings" w:hAnsi="Wingdings" w:hint="default"/>
+        <w:sz w:val="20"/>
+      </w:rPr>
+    </w:lvl>
+    <w:lvl w:ilvl="3" w:tentative="1">
+      <w:start w:val="1"/>
+      <w:numFmt w:val="bullet"/>
+      <w:lvlText w:val=""/>
+      <w:lvlJc w:val="left"/>
+      <w:pPr>
+        <w:tabs>
+          <w:tab w:val="num" w:pos="2880"/>
+        </w:tabs>
+        <w:ind w:left="2880" w:hanging="360"/>
+      </w:pPr>
+      <w:rPr>
+        <w:rFonts w:ascii="Wingdings" w:hAnsi="Wingdings" w:hint="default"/>
+        <w:sz w:val="20"/>
+      </w:rPr>
+    </w:lvl>
+    <w:lvl w:ilvl="4" w:tentative="1">
+      <w:start w:val="1"/>
+      <w:numFmt w:val="bullet"/>
+      <w:lvlText w:val=""/>
+      <w:lvlJc w:val="left"/>
+      <w:pPr>
+        <w:tabs>
+          <w:tab w:val="num" w:pos="3600"/>
+        </w:tabs>
+        <w:ind w:left="3600" w:hanging="360"/>
+      </w:pPr>
+      <w:rPr>
+        <w:rFonts w:ascii="Wingdings" w:hAnsi="Wingdings" w:hint="default"/>
+        <w:sz w:val="20"/>
+      </w:rPr>
+    </w:lvl>
+    <w:lvl w:ilvl="5" w:tentative="1">
+      <w:start w:val="1"/>
+      <w:numFmt w:val="bullet"/>
+      <w:lvlText w:val=""/>
+      <w:lvlJc w:val="left"/>
+      <w:pPr>
+        <w:tabs>
+          <w:tab w:val="num" w:pos="4320"/>
+        </w:tabs>
+        <w:ind w:left="4320" w:hanging="360"/>
+      </w:pPr>
+      <w:rPr>
+        <w:rFonts w:ascii="Wingdings" w:hAnsi="Wingdings" w:hint="default"/>
+        <w:sz w:val="20"/>
+      </w:rPr>
+    </w:lvl>
+    <w:lvl w:ilvl="6" w:tentative="1">
+      <w:start w:val="1"/>
+      <w:numFmt w:val="bullet"/>
+      <w:lvlText w:val=""/>
+      <w:lvlJc w:val="left"/>
+      <w:pPr>
+        <w:tabs>
+          <w:tab w:val="num" w:pos="5040"/>
+        </w:tabs>
+        <w:ind w:left="5040" w:hanging="360"/>
+      </w:pPr>
+      <w:rPr>
+        <w:rFonts w:ascii="Wingdings" w:hAnsi="Wingdings" w:hint="default"/>
+        <w:sz w:val="20"/>
+      </w:rPr>
+    </w:lvl>
+    <w:lvl w:ilvl="7" w:tentative="1">
+      <w:start w:val="1"/>
+      <w:numFmt w:val="bullet"/>
+      <w:lvlText w:val=""/>
+      <w:lvlJc w:val="left"/>
+      <w:pPr>
+        <w:tabs>
+          <w:tab w:val="num" w:pos="5760"/>
+        </w:tabs>
+        <w:ind w:left="5760" w:hanging="360"/>
+      </w:pPr>
+      <w:rPr>
+        <w:rFonts w:ascii="Wingdings" w:hAnsi="Wingdings" w:hint="default"/>
+        <w:sz w:val="20"/>
+      </w:rPr>
+    </w:lvl>
+    <w:lvl w:ilvl="8" w:tentative="1">
+      <w:start w:val="1"/>
+      <w:numFmt w:val="bullet"/>
+      <w:lvlText w:val=""/>
+      <w:lvlJc w:val="left"/>
+      <w:pPr>
+        <w:tabs>
+          <w:tab w:val="num" w:pos="6480"/>
+        </w:tabs>
+        <w:ind w:left="6480" w:hanging="360"/>
+      </w:pPr>
+      <w:rPr>
+        <w:rFonts w:ascii="Wingdings" w:hAnsi="Wingdings" w:hint="default"/>
+        <w:sz w:val="20"/>
+      </w:rPr>
+    </w:lvl>
+  </w:abstractNum>
+  <w:abstractNum w:abstractNumId="39" w15:restartNumberingAfterBreak="0">
     <w:nsid w:val="6D826E41"/>
     <w:multiLevelType w:val="multilevel"/>
     <w:tmpl w:val="F342C57C"/>
@@ -14382,7 +15407,7 @@
       </w:rPr>
     </w:lvl>
   </w:abstractNum>
-  <w:abstractNum w:abstractNumId="32" w15:restartNumberingAfterBreak="0">
+  <w:abstractNum w:abstractNumId="40" w15:restartNumberingAfterBreak="0">
     <w:nsid w:val="703320E2"/>
     <w:multiLevelType w:val="multilevel"/>
     <w:tmpl w:val="6A54A23A"/>
@@ -14531,7 +15556,7 @@
       </w:rPr>
     </w:lvl>
   </w:abstractNum>
-  <w:abstractNum w:abstractNumId="33" w15:restartNumberingAfterBreak="0">
+  <w:abstractNum w:abstractNumId="41" w15:restartNumberingAfterBreak="0">
     <w:nsid w:val="72CF3047"/>
     <w:multiLevelType w:val="multilevel"/>
     <w:tmpl w:val="BD7CDF10"/>
@@ -14680,7 +15705,7 @@
       </w:rPr>
     </w:lvl>
   </w:abstractNum>
-  <w:abstractNum w:abstractNumId="34" w15:restartNumberingAfterBreak="0">
+  <w:abstractNum w:abstractNumId="42" w15:restartNumberingAfterBreak="0">
     <w:nsid w:val="77F5357F"/>
     <w:multiLevelType w:val="multilevel"/>
     <w:tmpl w:val="135062E0"/>
@@ -14829,7 +15854,7 @@
       </w:rPr>
     </w:lvl>
   </w:abstractNum>
-  <w:abstractNum w:abstractNumId="35" w15:restartNumberingAfterBreak="0">
+  <w:abstractNum w:abstractNumId="43" w15:restartNumberingAfterBreak="0">
     <w:nsid w:val="7A637FCB"/>
     <w:multiLevelType w:val="multilevel"/>
     <w:tmpl w:val="A1941854"/>
@@ -14978,7 +16003,7 @@
       </w:rPr>
     </w:lvl>
   </w:abstractNum>
-  <w:abstractNum w:abstractNumId="36" w15:restartNumberingAfterBreak="0">
+  <w:abstractNum w:abstractNumId="44" w15:restartNumberingAfterBreak="0">
     <w:nsid w:val="7EB653FB"/>
     <w:multiLevelType w:val="multilevel"/>
     <w:tmpl w:val="2AF2C9D0"/>
@@ -15092,97 +16117,97 @@
     </w:lvl>
   </w:abstractNum>
   <w:num w:numId="1" w16cid:durableId="1114397228">
-    <w:abstractNumId w:val="19"/>
+    <w:abstractNumId w:val="22"/>
   </w:num>
   <w:num w:numId="2" w16cid:durableId="682586040">
     <w:abstractNumId w:val="6"/>
   </w:num>
   <w:num w:numId="3" w16cid:durableId="1222861426">
-    <w:abstractNumId w:val="13"/>
+    <w:abstractNumId w:val="16"/>
   </w:num>
   <w:num w:numId="4" w16cid:durableId="1448355712">
-    <w:abstractNumId w:val="34"/>
+    <w:abstractNumId w:val="42"/>
   </w:num>
   <w:num w:numId="5" w16cid:durableId="562640783">
     <w:abstractNumId w:val="0"/>
   </w:num>
   <w:num w:numId="6" w16cid:durableId="728840447">
-    <w:abstractNumId w:val="14"/>
+    <w:abstractNumId w:val="17"/>
   </w:num>
   <w:num w:numId="7" w16cid:durableId="1162741846">
-    <w:abstractNumId w:val="15"/>
+    <w:abstractNumId w:val="18"/>
   </w:num>
   <w:num w:numId="8" w16cid:durableId="845483017">
     <w:abstractNumId w:val="10"/>
   </w:num>
   <w:num w:numId="9" w16cid:durableId="690642211">
-    <w:abstractNumId w:val="28"/>
+    <w:abstractNumId w:val="34"/>
   </w:num>
   <w:num w:numId="10" w16cid:durableId="1738702395">
-    <w:abstractNumId w:val="23"/>
+    <w:abstractNumId w:val="29"/>
   </w:num>
   <w:num w:numId="11" w16cid:durableId="2099132265">
     <w:abstractNumId w:val="1"/>
   </w:num>
   <w:num w:numId="12" w16cid:durableId="1501391729">
-    <w:abstractNumId w:val="31"/>
+    <w:abstractNumId w:val="39"/>
   </w:num>
   <w:num w:numId="13" w16cid:durableId="1236865160">
     <w:abstractNumId w:val="4"/>
   </w:num>
   <w:num w:numId="14" w16cid:durableId="248589603">
-    <w:abstractNumId w:val="24"/>
+    <w:abstractNumId w:val="30"/>
   </w:num>
   <w:num w:numId="15" w16cid:durableId="532309917">
     <w:abstractNumId w:val="5"/>
   </w:num>
   <w:num w:numId="16" w16cid:durableId="1016347486">
-    <w:abstractNumId w:val="22"/>
+    <w:abstractNumId w:val="27"/>
   </w:num>
   <w:num w:numId="17" w16cid:durableId="1235430928">
-    <w:abstractNumId w:val="16"/>
+    <w:abstractNumId w:val="19"/>
   </w:num>
   <w:num w:numId="18" w16cid:durableId="1983073270">
+    <w:abstractNumId w:val="23"/>
+  </w:num>
+  <w:num w:numId="19" w16cid:durableId="1113867910">
+    <w:abstractNumId w:val="36"/>
+  </w:num>
+  <w:num w:numId="20" w16cid:durableId="449251560">
+    <w:abstractNumId w:val="21"/>
+  </w:num>
+  <w:num w:numId="21" w16cid:durableId="1131555259">
+    <w:abstractNumId w:val="33"/>
+  </w:num>
+  <w:num w:numId="22" w16cid:durableId="1584682546">
     <w:abstractNumId w:val="20"/>
   </w:num>
-  <w:num w:numId="19" w16cid:durableId="1113867910">
-    <w:abstractNumId w:val="29"/>
-  </w:num>
-  <w:num w:numId="20" w16cid:durableId="449251560">
-    <w:abstractNumId w:val="18"/>
-  </w:num>
-  <w:num w:numId="21" w16cid:durableId="1131555259">
-    <w:abstractNumId w:val="27"/>
-  </w:num>
-  <w:num w:numId="22" w16cid:durableId="1584682546">
-    <w:abstractNumId w:val="17"/>
-  </w:num>
   <w:num w:numId="23" w16cid:durableId="1743287238">
-    <w:abstractNumId w:val="35"/>
+    <w:abstractNumId w:val="43"/>
   </w:num>
   <w:num w:numId="24" w16cid:durableId="1940142210">
-    <w:abstractNumId w:val="21"/>
+    <w:abstractNumId w:val="26"/>
   </w:num>
   <w:num w:numId="25" w16cid:durableId="305625524">
     <w:abstractNumId w:val="3"/>
   </w:num>
   <w:num w:numId="26" w16cid:durableId="384641986">
-    <w:abstractNumId w:val="11"/>
+    <w:abstractNumId w:val="13"/>
   </w:num>
   <w:num w:numId="27" w16cid:durableId="354312747">
-    <w:abstractNumId w:val="32"/>
+    <w:abstractNumId w:val="40"/>
   </w:num>
   <w:num w:numId="28" w16cid:durableId="2136168573">
-    <w:abstractNumId w:val="25"/>
+    <w:abstractNumId w:val="31"/>
   </w:num>
   <w:num w:numId="29" w16cid:durableId="1515192694">
     <w:abstractNumId w:val="2"/>
   </w:num>
   <w:num w:numId="30" w16cid:durableId="2010787404">
-    <w:abstractNumId w:val="33"/>
+    <w:abstractNumId w:val="41"/>
   </w:num>
   <w:num w:numId="31" w16cid:durableId="1260216984">
-    <w:abstractNumId w:val="26"/>
+    <w:abstractNumId w:val="32"/>
   </w:num>
   <w:num w:numId="32" w16cid:durableId="1717898394">
     <w:abstractNumId w:val="9"/>
@@ -15191,16 +16216,40 @@
     <w:abstractNumId w:val="7"/>
   </w:num>
   <w:num w:numId="34" w16cid:durableId="872766212">
-    <w:abstractNumId w:val="12"/>
+    <w:abstractNumId w:val="15"/>
   </w:num>
   <w:num w:numId="35" w16cid:durableId="2097289890">
-    <w:abstractNumId w:val="30"/>
+    <w:abstractNumId w:val="37"/>
   </w:num>
   <w:num w:numId="36" w16cid:durableId="1734738046">
-    <w:abstractNumId w:val="36"/>
+    <w:abstractNumId w:val="44"/>
   </w:num>
   <w:num w:numId="37" w16cid:durableId="784933706">
     <w:abstractNumId w:val="8"/>
+  </w:num>
+  <w:num w:numId="38" w16cid:durableId="1555041231">
+    <w:abstractNumId w:val="35"/>
+  </w:num>
+  <w:num w:numId="39" w16cid:durableId="533158922">
+    <w:abstractNumId w:val="12"/>
+  </w:num>
+  <w:num w:numId="40" w16cid:durableId="208689339">
+    <w:abstractNumId w:val="11"/>
+  </w:num>
+  <w:num w:numId="41" w16cid:durableId="1493135372">
+    <w:abstractNumId w:val="28"/>
+  </w:num>
+  <w:num w:numId="42" w16cid:durableId="1106197622">
+    <w:abstractNumId w:val="24"/>
+  </w:num>
+  <w:num w:numId="43" w16cid:durableId="169957269">
+    <w:abstractNumId w:val="25"/>
+  </w:num>
+  <w:num w:numId="44" w16cid:durableId="1657026462">
+    <w:abstractNumId w:val="14"/>
+  </w:num>
+  <w:num w:numId="45" w16cid:durableId="1049451495">
+    <w:abstractNumId w:val="38"/>
   </w:num>
 </w:numbering>
 </file>

</xml_diff>